<commit_message>
aft-rt-rgi: generaliza placeholder de UF no cabecalho do RT (GO -> XX)
O numero do processo no template trazia "GO" fixo; vira "XX" para nao
sugerir Goias a auditores de outras SRTEs que usem o template.
</commit_message>
<xml_diff>
--- a/aft-rt-rgi/template.docx
+++ b/aft-rt-rgi/template.docx
@@ -240,6 +240,9 @@
     <w:p>
       <w:pPr>
         <w:pStyle w:val="Corpodetexto"/>
+        <w:tabs>
+          <w:tab w:val="left" w:pos="5815"/>
+        </w:tabs>
         <w:spacing w:line="360" w:lineRule="auto"/>
         <w:ind w:left="112" w:right="829" w:firstLine="708"/>
         <w:jc w:val="both"/>
@@ -262,6 +265,17 @@
           <w:szCs w:val="22"/>
         </w:rPr>
         <w:t>2. DA AÇÃO FISCAL:</w:t>
+      </w:r>
+      <w:r>
+        <w:rPr>
+          <w:rFonts w:ascii="Tahoma" w:hAnsi="Tahoma" w:cs="Tahoma"/>
+          <w:b/>
+          <w:bCs/>
+          <w:spacing w:val="-2"/>
+          <w:sz w:val="22"/>
+          <w:szCs w:val="22"/>
+        </w:rPr>
+        <w:tab/>
       </w:r>
     </w:p>
     <w:p>
@@ -327,7 +341,6 @@
         </w:rPr>
         <w:t xml:space="preserve"> </w:t>
       </w:r>
-      <w:proofErr w:type="gramStart"/>
       <w:r>
         <w:rPr>
           <w:rFonts w:ascii="Tahoma" w:hAnsi="Tahoma" w:cs="Tahoma"/>
@@ -353,7 +366,6 @@
         </w:rPr>
         <w:t>dispõe</w:t>
       </w:r>
-      <w:proofErr w:type="gramEnd"/>
       <w:r>
         <w:rPr>
           <w:rFonts w:ascii="Tahoma" w:hAnsi="Tahoma" w:cs="Tahoma"/>
@@ -796,23 +808,13 @@
         </w:rPr>
         <w:t xml:space="preserve"> </w:t>
       </w:r>
-      <w:proofErr w:type="spellStart"/>
-      <w:r>
-        <w:rPr>
-          <w:rFonts w:ascii="Tahoma" w:hAnsi="Tahoma" w:cs="Tahoma"/>
-          <w:sz w:val="22"/>
-          <w:szCs w:val="22"/>
-        </w:rPr>
-        <w:t>Mannrich</w:t>
-      </w:r>
-      <w:proofErr w:type="spellEnd"/>
-      <w:r>
-        <w:rPr>
-          <w:rFonts w:ascii="Tahoma" w:hAnsi="Tahoma" w:cs="Tahoma"/>
-          <w:sz w:val="22"/>
-          <w:szCs w:val="22"/>
-        </w:rPr>
-        <w:t>,</w:t>
+      <w:r>
+        <w:rPr>
+          <w:rFonts w:ascii="Tahoma" w:hAnsi="Tahoma" w:cs="Tahoma"/>
+          <w:sz w:val="22"/>
+          <w:szCs w:val="22"/>
+        </w:rPr>
+        <w:t>Mannrich,</w:t>
       </w:r>
       <w:r>
         <w:rPr>
@@ -879,27 +881,7 @@
           <w:sz w:val="20"/>
           <w:szCs w:val="20"/>
         </w:rPr>
-        <w:t xml:space="preserve">como </w:t>
-      </w:r>
-      <w:proofErr w:type="gramStart"/>
-      <w:r>
-        <w:rPr>
-          <w:rFonts w:ascii="Tahoma" w:hAnsi="Tahoma" w:cs="Tahoma"/>
-          <w:i/>
-          <w:sz w:val="20"/>
-          <w:szCs w:val="20"/>
-        </w:rPr>
-        <w:t>as referentes</w:t>
-      </w:r>
-      <w:proofErr w:type="gramEnd"/>
-      <w:r>
-        <w:rPr>
-          <w:rFonts w:ascii="Tahoma" w:hAnsi="Tahoma" w:cs="Tahoma"/>
-          <w:i/>
-          <w:sz w:val="20"/>
-          <w:szCs w:val="20"/>
-        </w:rPr>
-        <w:t xml:space="preserve"> a</w:t>
+        <w:t>como as referentes a</w:t>
       </w:r>
       <w:r>
         <w:rPr>
@@ -1752,7 +1734,12 @@
           <w:szCs w:val="22"/>
         </w:rPr>
         <w:sectPr>
-          <w:headerReference w:type="default" r:id="rId8"/>
+          <w:headerReference w:type="even" r:id="rId8"/>
+          <w:headerReference w:type="default" r:id="rId9"/>
+          <w:footerReference w:type="even" r:id="rId10"/>
+          <w:footerReference w:type="default" r:id="rId11"/>
+          <w:headerReference w:type="first" r:id="rId12"/>
+          <w:footerReference w:type="first" r:id="rId13"/>
           <w:type w:val="continuous"/>
           <w:pgSz w:w="11910" w:h="16850"/>
           <w:pgMar w:top="1560" w:right="560" w:bottom="1160" w:left="740" w:header="327" w:footer="397" w:gutter="0"/>
@@ -2909,33 +2896,15 @@
           <w:sz w:val="22"/>
           <w:szCs w:val="22"/>
         </w:rPr>
-        <w:t xml:space="preserve">Regulamentadoras expedidas </w:t>
-      </w:r>
-      <w:proofErr w:type="gramStart"/>
-      <w:r>
-        <w:rPr>
-          <w:rFonts w:ascii="Tahoma" w:hAnsi="Tahoma" w:cs="Tahoma"/>
-          <w:sz w:val="22"/>
-          <w:szCs w:val="22"/>
-        </w:rPr>
-        <w:t xml:space="preserve">pelo </w:t>
-      </w:r>
-      <w:r>
-        <w:rPr>
-          <w:rFonts w:ascii="Tahoma" w:hAnsi="Tahoma" w:cs="Tahoma"/>
-          <w:sz w:val="22"/>
-          <w:szCs w:val="22"/>
-        </w:rPr>
-        <w:t xml:space="preserve"> Ministério</w:t>
-      </w:r>
-      <w:proofErr w:type="gramEnd"/>
-      <w:r>
-        <w:rPr>
-          <w:rFonts w:ascii="Tahoma" w:hAnsi="Tahoma" w:cs="Tahoma"/>
-          <w:sz w:val="22"/>
-          <w:szCs w:val="22"/>
-        </w:rPr>
-        <w:t xml:space="preserve"> do Trabalho</w:t>
+        <w:t xml:space="preserve">Regulamentadoras expedidas pelo </w:t>
+      </w:r>
+      <w:r>
+        <w:rPr>
+          <w:rFonts w:ascii="Tahoma" w:hAnsi="Tahoma" w:cs="Tahoma"/>
+          <w:sz w:val="22"/>
+          <w:szCs w:val="22"/>
+        </w:rPr>
+        <w:t xml:space="preserve"> Ministério do Trabalho</w:t>
       </w:r>
       <w:r>
         <w:rPr>
@@ -3908,9 +3877,8 @@
           <w:szCs w:val="22"/>
           <w:u w:val="single"/>
         </w:rPr>
-        <w:t xml:space="preserve"> </w:t>
-      </w:r>
-      <w:proofErr w:type="gramStart"/>
+        <w:t xml:space="preserve"> -</w:t>
+      </w:r>
       <w:r>
         <w:rPr>
           <w:rFonts w:ascii="Tahoma" w:hAnsi="Tahoma" w:cs="Tahoma"/>
@@ -3920,7 +3888,7 @@
           <w:szCs w:val="22"/>
           <w:u w:val="single"/>
         </w:rPr>
-        <w:t>-</w:t>
+        <w:t xml:space="preserve"> </w:t>
       </w:r>
       <w:r>
         <w:rPr>
@@ -3931,30 +3899,7 @@
           <w:szCs w:val="22"/>
           <w:u w:val="single"/>
         </w:rPr>
-        <w:t xml:space="preserve"> </w:t>
-      </w:r>
-      <w:r>
-        <w:rPr>
-          <w:rFonts w:ascii="Tahoma" w:hAnsi="Tahoma" w:cs="Tahoma"/>
-          <w:b/>
-          <w:bCs/>
-          <w:sz w:val="22"/>
-          <w:szCs w:val="22"/>
-          <w:u w:val="single"/>
-        </w:rPr>
-        <w:t xml:space="preserve"> Paralisação</w:t>
-      </w:r>
-      <w:proofErr w:type="gramEnd"/>
-      <w:r>
-        <w:rPr>
-          <w:rFonts w:ascii="Tahoma" w:hAnsi="Tahoma" w:cs="Tahoma"/>
-          <w:b/>
-          <w:bCs/>
-          <w:sz w:val="22"/>
-          <w:szCs w:val="22"/>
-          <w:u w:val="single"/>
-        </w:rPr>
-        <w:t>: TOTAL</w:t>
+        <w:t xml:space="preserve"> Paralisação: TOTAL</w:t>
       </w:r>
     </w:p>
     <w:p>
@@ -4092,7 +4037,7 @@
                     <pic:cNvPicPr/>
                   </pic:nvPicPr>
                   <pic:blipFill>
-                    <a:blip r:embed="rId9" cstate="print"/>
+                    <a:blip r:embed="rId14" cstate="print"/>
                     <a:stretch>
                       <a:fillRect/>
                     </a:stretch>
@@ -5753,25 +5698,7 @@
           <w:sz w:val="21"/>
           <w:szCs w:val="21"/>
         </w:rPr>
-        <w:t xml:space="preserve"> verificou-se a exposição individual ou de poucos trabalhadores expostos aos fatores de risco, será utilizada a Tabela 3.3 para a determinação do excesso de risco, sendo que as medidas administrativas de Interdição ou Embargo devem ser aplicadas sempre que o Auditor-Fiscal do Trabalho constatar a existência de excesso de risco Extremo (E) </w:t>
-      </w:r>
-      <w:proofErr w:type="gramStart"/>
-      <w:r>
-        <w:rPr>
-          <w:rFonts w:ascii="Tahoma" w:hAnsi="Tahoma" w:cs="Tahoma"/>
-          <w:sz w:val="21"/>
-          <w:szCs w:val="21"/>
-        </w:rPr>
-        <w:t>ou Significativo</w:t>
-      </w:r>
-      <w:proofErr w:type="gramEnd"/>
-      <w:r>
-        <w:rPr>
-          <w:rFonts w:ascii="Tahoma" w:hAnsi="Tahoma" w:cs="Tahoma"/>
-          <w:sz w:val="21"/>
-          <w:szCs w:val="21"/>
-        </w:rPr>
-        <w:t xml:space="preserve"> (S).</w:t>
+        <w:t xml:space="preserve"> verificou-se a exposição individual ou de poucos trabalhadores expostos aos fatores de risco, será utilizada a Tabela 3.3 para a determinação do excesso de risco, sendo que as medidas administrativas de Interdição ou Embargo devem ser aplicadas sempre que o Auditor-Fiscal do Trabalho constatar a existência de excesso de risco Extremo (E) ou Significativo (S).</w:t>
       </w:r>
     </w:p>
     <w:p>
@@ -5824,7 +5751,7 @@
                           <pic:cNvPicPr/>
                         </pic:nvPicPr>
                         <pic:blipFill>
-                          <a:blip r:embed="rId10" cstate="print"/>
+                          <a:blip r:embed="rId15" cstate="print"/>
                           <a:stretch>
                             <a:fillRect/>
                           </a:stretch>
@@ -6010,7 +5937,7 @@
                   <o:lock v:ext="edit" aspectratio="t"/>
                 </v:shapetype>
                 <v:shape id="Image 56" o:spid="_x0000_s1027" type="#_x0000_t75" style="position:absolute;width:53605;height:36203;visibility:visible;mso-wrap-style:square" o:gfxdata="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">
-                  <v:imagedata r:id="rId14" o:title=""/>
+                  <v:imagedata r:id="rId16" o:title=""/>
                 </v:shape>
                 <v:shape id="Graphic 57" o:spid="_x0000_s1028" style="position:absolute;left:16902;top:20826;width:10179;height:6604;visibility:visible;mso-wrap-style:square;v-text-anchor:top" coordsize="1017905,660400" o:gfxdata="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" path="m707390,165481r-6465,-13462l670560,88646r-39370,75565l666153,164795r-8293,495224l664210,660146r8293,-495237l707390,165481xem766787,41402r-58762,l695274,41402r-457,34798l766787,41402xem771525,39116l695833,r-470,34899l,26416r,6350l695274,41249r12751,l767105,41249r4420,-2133xem1017905,163576r-6465,-13462l981075,86741r-39370,75565l976668,162890r-8293,495224l974725,658241r8293,-495237l1017905,163576xe" fillcolor="#001f5f" stroked="f">
                   <v:path arrowok="t"/>
@@ -6164,29 +6091,7 @@
           <w:sz w:val="22"/>
           <w:szCs w:val="22"/>
         </w:rPr>
-        <w:t xml:space="preserve">Fator de </w:t>
-      </w:r>
-      <w:proofErr w:type="gramStart"/>
-      <w:r>
-        <w:rPr>
-          <w:rFonts w:ascii="Tahoma" w:hAnsi="Tahoma" w:cs="Tahoma"/>
-          <w:b/>
-          <w:bCs/>
-          <w:sz w:val="22"/>
-          <w:szCs w:val="22"/>
-        </w:rPr>
-        <w:t>Risco :</w:t>
-      </w:r>
-      <w:proofErr w:type="gramEnd"/>
-      <w:r>
-        <w:rPr>
-          <w:rFonts w:ascii="Tahoma" w:hAnsi="Tahoma" w:cs="Tahoma"/>
-          <w:b/>
-          <w:bCs/>
-          <w:sz w:val="22"/>
-          <w:szCs w:val="22"/>
-        </w:rPr>
-        <w:t xml:space="preserve"> excesso de risco </w:t>
+        <w:t xml:space="preserve">Fator de Risco : excesso de risco </w:t>
       </w:r>
     </w:p>
     <w:p>
@@ -6360,25 +6265,7 @@
           <w:sz w:val="22"/>
           <w:szCs w:val="22"/>
         </w:rPr>
-        <w:t xml:space="preserve"> sobre quais objetos solicita a suspensão da interdição, podendo ser um ou </w:t>
-      </w:r>
-      <w:proofErr w:type="gramStart"/>
-      <w:r>
-        <w:rPr>
-          <w:rFonts w:ascii="Tahoma" w:hAnsi="Tahoma" w:cs="Tahoma"/>
-          <w:sz w:val="22"/>
-          <w:szCs w:val="22"/>
-        </w:rPr>
-        <w:t>todos objetos</w:t>
-      </w:r>
-      <w:proofErr w:type="gramEnd"/>
-      <w:r>
-        <w:rPr>
-          <w:rFonts w:ascii="Tahoma" w:hAnsi="Tahoma" w:cs="Tahoma"/>
-          <w:sz w:val="22"/>
-          <w:szCs w:val="22"/>
-        </w:rPr>
-        <w:t>;</w:t>
+        <w:t xml:space="preserve"> sobre quais objetos solicita a suspensão da interdição, podendo ser um ou todos objetos;</w:t>
       </w:r>
     </w:p>
     <w:p>
@@ -6594,7 +6481,7 @@
                           <pic:cNvPicPr/>
                         </pic:nvPicPr>
                         <pic:blipFill>
-                          <a:blip r:embed="rId9" cstate="print"/>
+                          <a:blip r:embed="rId14" cstate="print"/>
                           <a:stretch>
                             <a:fillRect/>
                           </a:stretch>
@@ -6622,7 +6509,7 @@
                   <v:path arrowok="t"/>
                 </v:shape>
                 <v:shape id="Image 41" o:spid="_x0000_s1028" type="#_x0000_t75" style="position:absolute;left:1167;width:16912;height:7639;visibility:visible;mso-wrap-style:square" o:gfxdata="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">
-                  <v:imagedata r:id="rId15" o:title=""/>
+                  <v:imagedata r:id="rId17" o:title=""/>
                 </v:shape>
                 <w10:wrap anchorx="page" anchory="page"/>
               </v:group>
@@ -6796,25 +6683,7 @@
           <w:sz w:val="21"/>
           <w:szCs w:val="21"/>
         </w:rPr>
-        <w:t xml:space="preserve">I - </w:t>
-      </w:r>
-      <w:proofErr w:type="gramStart"/>
-      <w:r>
-        <w:rPr>
-          <w:rFonts w:ascii="Tahoma" w:hAnsi="Tahoma" w:cs="Tahoma"/>
-          <w:sz w:val="21"/>
-          <w:szCs w:val="21"/>
-        </w:rPr>
-        <w:t>o</w:t>
-      </w:r>
-      <w:proofErr w:type="gramEnd"/>
-      <w:r>
-        <w:rPr>
-          <w:rFonts w:ascii="Tahoma" w:hAnsi="Tahoma" w:cs="Tahoma"/>
-          <w:sz w:val="21"/>
-          <w:szCs w:val="21"/>
-        </w:rPr>
-        <w:t xml:space="preserve"> número do Termo de Interdição;</w:t>
+        <w:t>I - o número do Termo de Interdição;</w:t>
       </w:r>
     </w:p>
     <w:p>
@@ -6834,25 +6703,7 @@
           <w:sz w:val="21"/>
           <w:szCs w:val="21"/>
         </w:rPr>
-        <w:t xml:space="preserve">II - </w:t>
-      </w:r>
-      <w:proofErr w:type="gramStart"/>
-      <w:r>
-        <w:rPr>
-          <w:rFonts w:ascii="Tahoma" w:hAnsi="Tahoma" w:cs="Tahoma"/>
-          <w:sz w:val="21"/>
-          <w:szCs w:val="21"/>
-        </w:rPr>
-        <w:t>a</w:t>
-      </w:r>
-      <w:proofErr w:type="gramEnd"/>
-      <w:r>
-        <w:rPr>
-          <w:rFonts w:ascii="Tahoma" w:hAnsi="Tahoma" w:cs="Tahoma"/>
-          <w:sz w:val="21"/>
-          <w:szCs w:val="21"/>
-        </w:rPr>
-        <w:t xml:space="preserve"> identificação da(s) máquina(s) ou setor de serviço;</w:t>
+        <w:t>II - a identificação da(s) máquina(s) ou setor de serviço;</w:t>
       </w:r>
     </w:p>
     <w:p>
@@ -7048,7 +6899,7 @@
                     <pic:cNvPicPr/>
                   </pic:nvPicPr>
                   <pic:blipFill>
-                    <a:blip r:embed="rId16">
+                    <a:blip r:embed="rId18">
                       <a:extLst>
                         <a:ext uri="{28A0092B-C50C-407E-A947-70E740481C1C}">
                           <a14:useLocalDpi xmlns:a14="http://schemas.microsoft.com/office/drawing/2010/main" val="0"/>
@@ -7333,7 +7184,7 @@
           <w:sz w:val="20"/>
           <w:szCs w:val="20"/>
         </w:rPr>
-        <w:t>GO</w:t>
+        <w:t>XX</w:t>
       </w:r>
       <w:r>
         <w:rPr>
@@ -7580,8 +7431,8 @@
       </w:pPr>
     </w:p>
     <w:sectPr>
-      <w:headerReference w:type="default" r:id="rId17"/>
-      <w:footerReference w:type="default" r:id="rId18"/>
+      <w:headerReference w:type="default" r:id="rId19"/>
+      <w:footerReference w:type="default" r:id="rId20"/>
       <w:pgSz w:w="11910" w:h="16850"/>
       <w:pgMar w:top="1843" w:right="1704" w:bottom="1417" w:left="851" w:header="624" w:footer="907" w:gutter="0"/>
       <w:cols w:space="720"/>
@@ -7611,6 +7462,36 @@
 </file>
 
 <file path=word/footer1.xml><?xml version="1.0" encoding="utf-8"?>
+<w:ftr xmlns:wpc="http://schemas.microsoft.com/office/word/2010/wordprocessingCanvas" xmlns:cx="http://schemas.microsoft.com/office/drawing/2014/chartex" xmlns:cx1="http://schemas.microsoft.com/office/drawing/2015/9/8/chartex" xmlns:cx2="http://schemas.microsoft.com/office/drawing/2015/10/21/chartex" xmlns:cx3="http://schemas.microsoft.com/office/drawing/2016/5/9/chartex" xmlns:cx4="http://schemas.microsoft.com/office/drawing/2016/5/10/chartex" xmlns:cx5="http://schemas.microsoft.com/office/drawing/2016/5/11/chartex" xmlns:cx6="http://schemas.microsoft.com/office/drawing/2016/5/12/chartex" xmlns:cx7="http://schemas.microsoft.com/office/drawing/2016/5/13/chartex" xmlns:cx8="http://schemas.microsoft.com/office/drawing/2016/5/14/chartex" xmlns:mc="http://schemas.openxmlformats.org/markup-compatibility/2006" xmlns:aink="http://schemas.microsoft.com/office/drawing/2016/ink" xmlns:am3d="http://schemas.microsoft.com/office/drawing/2017/model3d" xmlns:o="urn:schemas-microsoft-com:office:office" xmlns:oel="http://schemas.microsoft.com/office/2019/extlst" xmlns:r="http://schemas.openxmlformats.org/officeDocument/2006/relationships" xmlns:m="http://schemas.openxmlformats.org/officeDocument/2006/math" xmlns:v="urn:schemas-microsoft-com:vml" xmlns:wp14="http://schemas.microsoft.com/office/word/2010/wordprocessingDrawing" xmlns:wp="http://schemas.openxmlformats.org/drawingml/2006/wordprocessingDrawing" xmlns:w10="urn:schemas-microsoft-com:office:word" xmlns:w="http://schemas.openxmlformats.org/wordprocessingml/2006/main" xmlns:w14="http://schemas.microsoft.com/office/word/2010/wordml" xmlns:w15="http://schemas.microsoft.com/office/word/2012/wordml" xmlns:w16cex="http://schemas.microsoft.com/office/word/2018/wordml/cex" xmlns:w16cid="http://schemas.microsoft.com/office/word/2016/wordml/cid" xmlns:w16="http://schemas.microsoft.com/office/word/2018/wordml" xmlns:w16du="http://schemas.microsoft.com/office/word/2023/wordml/word16du" xmlns:w16sdtdh="http://schemas.microsoft.com/office/word/2020/wordml/sdtdatahash" xmlns:w16sdtfl="http://schemas.microsoft.com/office/word/2024/wordml/sdtformatlock" xmlns:w16se="http://schemas.microsoft.com/office/word/2015/wordml/symex" xmlns:wpg="http://schemas.microsoft.com/office/word/2010/wordprocessingGroup" xmlns:wpi="http://schemas.microsoft.com/office/word/2010/wordprocessingInk" xmlns:wne="http://schemas.microsoft.com/office/word/2006/wordml" xmlns:wps="http://schemas.microsoft.com/office/word/2010/wordprocessingShape" mc:Ignorable="w14 w15 w16se w16cid w16 w16cex w16sdtdh w16sdtfl w16du wp14">
+  <w:p>
+    <w:pPr>
+      <w:pStyle w:val="Rodap"/>
+    </w:pPr>
+  </w:p>
+</w:ftr>
+</file>
+
+<file path=word/footer2.xml><?xml version="1.0" encoding="utf-8"?>
+<w:ftr xmlns:wpc="http://schemas.microsoft.com/office/word/2010/wordprocessingCanvas" xmlns:cx="http://schemas.microsoft.com/office/drawing/2014/chartex" xmlns:cx1="http://schemas.microsoft.com/office/drawing/2015/9/8/chartex" xmlns:cx2="http://schemas.microsoft.com/office/drawing/2015/10/21/chartex" xmlns:cx3="http://schemas.microsoft.com/office/drawing/2016/5/9/chartex" xmlns:cx4="http://schemas.microsoft.com/office/drawing/2016/5/10/chartex" xmlns:cx5="http://schemas.microsoft.com/office/drawing/2016/5/11/chartex" xmlns:cx6="http://schemas.microsoft.com/office/drawing/2016/5/12/chartex" xmlns:cx7="http://schemas.microsoft.com/office/drawing/2016/5/13/chartex" xmlns:cx8="http://schemas.microsoft.com/office/drawing/2016/5/14/chartex" xmlns:mc="http://schemas.openxmlformats.org/markup-compatibility/2006" xmlns:aink="http://schemas.microsoft.com/office/drawing/2016/ink" xmlns:am3d="http://schemas.microsoft.com/office/drawing/2017/model3d" xmlns:o="urn:schemas-microsoft-com:office:office" xmlns:oel="http://schemas.microsoft.com/office/2019/extlst" xmlns:r="http://schemas.openxmlformats.org/officeDocument/2006/relationships" xmlns:m="http://schemas.openxmlformats.org/officeDocument/2006/math" xmlns:v="urn:schemas-microsoft-com:vml" xmlns:wp14="http://schemas.microsoft.com/office/word/2010/wordprocessingDrawing" xmlns:wp="http://schemas.openxmlformats.org/drawingml/2006/wordprocessingDrawing" xmlns:w10="urn:schemas-microsoft-com:office:word" xmlns:w="http://schemas.openxmlformats.org/wordprocessingml/2006/main" xmlns:w14="http://schemas.microsoft.com/office/word/2010/wordml" xmlns:w15="http://schemas.microsoft.com/office/word/2012/wordml" xmlns:w16cex="http://schemas.microsoft.com/office/word/2018/wordml/cex" xmlns:w16cid="http://schemas.microsoft.com/office/word/2016/wordml/cid" xmlns:w16="http://schemas.microsoft.com/office/word/2018/wordml" xmlns:w16du="http://schemas.microsoft.com/office/word/2023/wordml/word16du" xmlns:w16sdtdh="http://schemas.microsoft.com/office/word/2020/wordml/sdtdatahash" xmlns:w16sdtfl="http://schemas.microsoft.com/office/word/2024/wordml/sdtformatlock" xmlns:w16se="http://schemas.microsoft.com/office/word/2015/wordml/symex" xmlns:wpg="http://schemas.microsoft.com/office/word/2010/wordprocessingGroup" xmlns:wpi="http://schemas.microsoft.com/office/word/2010/wordprocessingInk" xmlns:wne="http://schemas.microsoft.com/office/word/2006/wordml" xmlns:wps="http://schemas.microsoft.com/office/word/2010/wordprocessingShape" mc:Ignorable="w14 w15 w16se w16cid w16 w16cex w16sdtdh w16sdtfl w16du wp14">
+  <w:p>
+    <w:pPr>
+      <w:pStyle w:val="Rodap"/>
+    </w:pPr>
+  </w:p>
+</w:ftr>
+</file>
+
+<file path=word/footer3.xml><?xml version="1.0" encoding="utf-8"?>
+<w:ftr xmlns:wpc="http://schemas.microsoft.com/office/word/2010/wordprocessingCanvas" xmlns:cx="http://schemas.microsoft.com/office/drawing/2014/chartex" xmlns:cx1="http://schemas.microsoft.com/office/drawing/2015/9/8/chartex" xmlns:cx2="http://schemas.microsoft.com/office/drawing/2015/10/21/chartex" xmlns:cx3="http://schemas.microsoft.com/office/drawing/2016/5/9/chartex" xmlns:cx4="http://schemas.microsoft.com/office/drawing/2016/5/10/chartex" xmlns:cx5="http://schemas.microsoft.com/office/drawing/2016/5/11/chartex" xmlns:cx6="http://schemas.microsoft.com/office/drawing/2016/5/12/chartex" xmlns:cx7="http://schemas.microsoft.com/office/drawing/2016/5/13/chartex" xmlns:cx8="http://schemas.microsoft.com/office/drawing/2016/5/14/chartex" xmlns:mc="http://schemas.openxmlformats.org/markup-compatibility/2006" xmlns:aink="http://schemas.microsoft.com/office/drawing/2016/ink" xmlns:am3d="http://schemas.microsoft.com/office/drawing/2017/model3d" xmlns:o="urn:schemas-microsoft-com:office:office" xmlns:oel="http://schemas.microsoft.com/office/2019/extlst" xmlns:r="http://schemas.openxmlformats.org/officeDocument/2006/relationships" xmlns:m="http://schemas.openxmlformats.org/officeDocument/2006/math" xmlns:v="urn:schemas-microsoft-com:vml" xmlns:wp14="http://schemas.microsoft.com/office/word/2010/wordprocessingDrawing" xmlns:wp="http://schemas.openxmlformats.org/drawingml/2006/wordprocessingDrawing" xmlns:w10="urn:schemas-microsoft-com:office:word" xmlns:w="http://schemas.openxmlformats.org/wordprocessingml/2006/main" xmlns:w14="http://schemas.microsoft.com/office/word/2010/wordml" xmlns:w15="http://schemas.microsoft.com/office/word/2012/wordml" xmlns:w16cex="http://schemas.microsoft.com/office/word/2018/wordml/cex" xmlns:w16cid="http://schemas.microsoft.com/office/word/2016/wordml/cid" xmlns:w16="http://schemas.microsoft.com/office/word/2018/wordml" xmlns:w16du="http://schemas.microsoft.com/office/word/2023/wordml/word16du" xmlns:w16sdtdh="http://schemas.microsoft.com/office/word/2020/wordml/sdtdatahash" xmlns:w16sdtfl="http://schemas.microsoft.com/office/word/2024/wordml/sdtformatlock" xmlns:w16se="http://schemas.microsoft.com/office/word/2015/wordml/symex" xmlns:wpg="http://schemas.microsoft.com/office/word/2010/wordprocessingGroup" xmlns:wpi="http://schemas.microsoft.com/office/word/2010/wordprocessingInk" xmlns:wne="http://schemas.microsoft.com/office/word/2006/wordml" xmlns:wps="http://schemas.microsoft.com/office/word/2010/wordprocessingShape" mc:Ignorable="w14 w15 w16se w16cid w16 w16cex w16sdtdh w16sdtfl w16du wp14">
+  <w:p>
+    <w:pPr>
+      <w:pStyle w:val="Rodap"/>
+    </w:pPr>
+  </w:p>
+</w:ftr>
+</file>
+
+<file path=word/footer4.xml><?xml version="1.0" encoding="utf-8"?>
 <w:ftr xmlns:wpc="http://schemas.microsoft.com/office/word/2010/wordprocessingCanvas" xmlns:cx="http://schemas.microsoft.com/office/drawing/2014/chartex" xmlns:cx1="http://schemas.microsoft.com/office/drawing/2015/9/8/chartex" xmlns:cx2="http://schemas.microsoft.com/office/drawing/2015/10/21/chartex" xmlns:cx3="http://schemas.microsoft.com/office/drawing/2016/5/9/chartex" xmlns:cx4="http://schemas.microsoft.com/office/drawing/2016/5/10/chartex" xmlns:cx5="http://schemas.microsoft.com/office/drawing/2016/5/11/chartex" xmlns:cx6="http://schemas.microsoft.com/office/drawing/2016/5/12/chartex" xmlns:cx7="http://schemas.microsoft.com/office/drawing/2016/5/13/chartex" xmlns:cx8="http://schemas.microsoft.com/office/drawing/2016/5/14/chartex" xmlns:mc="http://schemas.openxmlformats.org/markup-compatibility/2006" xmlns:aink="http://schemas.microsoft.com/office/drawing/2016/ink" xmlns:am3d="http://schemas.microsoft.com/office/drawing/2017/model3d" xmlns:o="urn:schemas-microsoft-com:office:office" xmlns:oel="http://schemas.microsoft.com/office/2019/extlst" xmlns:r="http://schemas.openxmlformats.org/officeDocument/2006/relationships" xmlns:m="http://schemas.openxmlformats.org/officeDocument/2006/math" xmlns:v="urn:schemas-microsoft-com:vml" xmlns:wp14="http://schemas.microsoft.com/office/word/2010/wordprocessingDrawing" xmlns:wp="http://schemas.openxmlformats.org/drawingml/2006/wordprocessingDrawing" xmlns:w10="urn:schemas-microsoft-com:office:word" xmlns:w="http://schemas.openxmlformats.org/wordprocessingml/2006/main" xmlns:w14="http://schemas.microsoft.com/office/word/2010/wordml" xmlns:w15="http://schemas.microsoft.com/office/word/2012/wordml" xmlns:w16cex="http://schemas.microsoft.com/office/word/2018/wordml/cex" xmlns:w16cid="http://schemas.microsoft.com/office/word/2016/wordml/cid" xmlns:w16="http://schemas.microsoft.com/office/word/2018/wordml" xmlns:w16du="http://schemas.microsoft.com/office/word/2023/wordml/word16du" xmlns:w16sdtdh="http://schemas.microsoft.com/office/word/2020/wordml/sdtdatahash" xmlns:w16sdtfl="http://schemas.microsoft.com/office/word/2024/wordml/sdtformatlock" xmlns:w16se="http://schemas.microsoft.com/office/word/2015/wordml/symex" xmlns:wpg="http://schemas.microsoft.com/office/word/2010/wordprocessingGroup" xmlns:wpi="http://schemas.microsoft.com/office/word/2010/wordprocessingInk" xmlns:wne="http://schemas.microsoft.com/office/word/2006/wordml" xmlns:wps="http://schemas.microsoft.com/office/word/2010/wordprocessingShape" mc:Ignorable="w14 w15 w16se w16cid w16 w16cex w16sdtdh w16sdtfl w16du wp14">
   <w:p>
     <w:pPr>
@@ -7646,6 +7527,16 @@
 <w:hdr xmlns:wpc="http://schemas.microsoft.com/office/word/2010/wordprocessingCanvas" xmlns:cx="http://schemas.microsoft.com/office/drawing/2014/chartex" xmlns:cx1="http://schemas.microsoft.com/office/drawing/2015/9/8/chartex" xmlns:cx2="http://schemas.microsoft.com/office/drawing/2015/10/21/chartex" xmlns:cx3="http://schemas.microsoft.com/office/drawing/2016/5/9/chartex" xmlns:cx4="http://schemas.microsoft.com/office/drawing/2016/5/10/chartex" xmlns:cx5="http://schemas.microsoft.com/office/drawing/2016/5/11/chartex" xmlns:cx6="http://schemas.microsoft.com/office/drawing/2016/5/12/chartex" xmlns:cx7="http://schemas.microsoft.com/office/drawing/2016/5/13/chartex" xmlns:cx8="http://schemas.microsoft.com/office/drawing/2016/5/14/chartex" xmlns:mc="http://schemas.openxmlformats.org/markup-compatibility/2006" xmlns:aink="http://schemas.microsoft.com/office/drawing/2016/ink" xmlns:am3d="http://schemas.microsoft.com/office/drawing/2017/model3d" xmlns:o="urn:schemas-microsoft-com:office:office" xmlns:oel="http://schemas.microsoft.com/office/2019/extlst" xmlns:r="http://schemas.openxmlformats.org/officeDocument/2006/relationships" xmlns:m="http://schemas.openxmlformats.org/officeDocument/2006/math" xmlns:v="urn:schemas-microsoft-com:vml" xmlns:wp14="http://schemas.microsoft.com/office/word/2010/wordprocessingDrawing" xmlns:wp="http://schemas.openxmlformats.org/drawingml/2006/wordprocessingDrawing" xmlns:w10="urn:schemas-microsoft-com:office:word" xmlns:w="http://schemas.openxmlformats.org/wordprocessingml/2006/main" xmlns:w14="http://schemas.microsoft.com/office/word/2010/wordml" xmlns:w15="http://schemas.microsoft.com/office/word/2012/wordml" xmlns:w16cex="http://schemas.microsoft.com/office/word/2018/wordml/cex" xmlns:w16cid="http://schemas.microsoft.com/office/word/2016/wordml/cid" xmlns:w16="http://schemas.microsoft.com/office/word/2018/wordml" xmlns:w16du="http://schemas.microsoft.com/office/word/2023/wordml/word16du" xmlns:w16sdtdh="http://schemas.microsoft.com/office/word/2020/wordml/sdtdatahash" xmlns:w16sdtfl="http://schemas.microsoft.com/office/word/2024/wordml/sdtformatlock" xmlns:w16se="http://schemas.microsoft.com/office/word/2015/wordml/symex" xmlns:wpg="http://schemas.microsoft.com/office/word/2010/wordprocessingGroup" xmlns:wpi="http://schemas.microsoft.com/office/word/2010/wordprocessingInk" xmlns:wne="http://schemas.microsoft.com/office/word/2006/wordml" xmlns:wps="http://schemas.microsoft.com/office/word/2010/wordprocessingShape" mc:Ignorable="w14 w15 w16se w16cid w16 w16cex w16sdtdh w16sdtfl w16du wp14">
   <w:p>
     <w:pPr>
+      <w:pStyle w:val="Cabealho"/>
+    </w:pPr>
+  </w:p>
+</w:hdr>
+</file>
+
+<file path=word/header2.xml><?xml version="1.0" encoding="utf-8"?>
+<w:hdr xmlns:wpc="http://schemas.microsoft.com/office/word/2010/wordprocessingCanvas" xmlns:cx="http://schemas.microsoft.com/office/drawing/2014/chartex" xmlns:cx1="http://schemas.microsoft.com/office/drawing/2015/9/8/chartex" xmlns:cx2="http://schemas.microsoft.com/office/drawing/2015/10/21/chartex" xmlns:cx3="http://schemas.microsoft.com/office/drawing/2016/5/9/chartex" xmlns:cx4="http://schemas.microsoft.com/office/drawing/2016/5/10/chartex" xmlns:cx5="http://schemas.microsoft.com/office/drawing/2016/5/11/chartex" xmlns:cx6="http://schemas.microsoft.com/office/drawing/2016/5/12/chartex" xmlns:cx7="http://schemas.microsoft.com/office/drawing/2016/5/13/chartex" xmlns:cx8="http://schemas.microsoft.com/office/drawing/2016/5/14/chartex" xmlns:mc="http://schemas.openxmlformats.org/markup-compatibility/2006" xmlns:aink="http://schemas.microsoft.com/office/drawing/2016/ink" xmlns:am3d="http://schemas.microsoft.com/office/drawing/2017/model3d" xmlns:o="urn:schemas-microsoft-com:office:office" xmlns:oel="http://schemas.microsoft.com/office/2019/extlst" xmlns:r="http://schemas.openxmlformats.org/officeDocument/2006/relationships" xmlns:m="http://schemas.openxmlformats.org/officeDocument/2006/math" xmlns:v="urn:schemas-microsoft-com:vml" xmlns:wp14="http://schemas.microsoft.com/office/word/2010/wordprocessingDrawing" xmlns:wp="http://schemas.openxmlformats.org/drawingml/2006/wordprocessingDrawing" xmlns:w10="urn:schemas-microsoft-com:office:word" xmlns:w="http://schemas.openxmlformats.org/wordprocessingml/2006/main" xmlns:w14="http://schemas.microsoft.com/office/word/2010/wordml" xmlns:w15="http://schemas.microsoft.com/office/word/2012/wordml" xmlns:w16cex="http://schemas.microsoft.com/office/word/2018/wordml/cex" xmlns:w16cid="http://schemas.microsoft.com/office/word/2016/wordml/cid" xmlns:w16="http://schemas.microsoft.com/office/word/2018/wordml" xmlns:w16du="http://schemas.microsoft.com/office/word/2023/wordml/word16du" xmlns:w16sdtdh="http://schemas.microsoft.com/office/word/2020/wordml/sdtdatahash" xmlns:w16sdtfl="http://schemas.microsoft.com/office/word/2024/wordml/sdtformatlock" xmlns:w16se="http://schemas.microsoft.com/office/word/2015/wordml/symex" xmlns:wpg="http://schemas.microsoft.com/office/word/2010/wordprocessingGroup" xmlns:wpi="http://schemas.microsoft.com/office/word/2010/wordprocessingInk" xmlns:wne="http://schemas.microsoft.com/office/word/2006/wordml" xmlns:wps="http://schemas.microsoft.com/office/word/2010/wordprocessingShape" mc:Ignorable="w14 w15 w16se w16cid w16 w16cex w16sdtdh w16sdtfl w16du wp14">
+  <w:p>
+    <w:pPr>
       <w:pStyle w:val="Corpodetexto"/>
       <w:spacing w:line="14" w:lineRule="auto"/>
       <w:rPr>
@@ -7657,17 +7548,203 @@
         <w:noProof/>
       </w:rPr>
       <mc:AlternateContent>
+        <mc:Choice Requires="wps">
+          <w:drawing>
+            <wp:anchor distT="0" distB="0" distL="0" distR="0" simplePos="0" relativeHeight="487445504" behindDoc="1" locked="0" layoutInCell="1" allowOverlap="1" wp14:anchorId="2AAC5969" wp14:editId="5145CC1E">
+              <wp:simplePos x="0" y="0"/>
+              <wp:positionH relativeFrom="page">
+                <wp:posOffset>2476982</wp:posOffset>
+              </wp:positionH>
+              <wp:positionV relativeFrom="page">
+                <wp:posOffset>208344</wp:posOffset>
+              </wp:positionV>
+              <wp:extent cx="3931920" cy="688943"/>
+              <wp:effectExtent l="0" t="0" r="0" b="0"/>
+              <wp:wrapNone/>
+              <wp:docPr id="4" name="Textbox 4"/>
+              <wp:cNvGraphicFramePr>
+                <a:graphicFrameLocks xmlns:a="http://schemas.openxmlformats.org/drawingml/2006/main"/>
+              </wp:cNvGraphicFramePr>
+              <a:graphic xmlns:a="http://schemas.openxmlformats.org/drawingml/2006/main">
+                <a:graphicData uri="http://schemas.microsoft.com/office/word/2010/wordprocessingShape">
+                  <wps:wsp>
+                    <wps:cNvSpPr txBox="1">
+                      <a:spLocks/>
+                    </wps:cNvSpPr>
+                    <wps:spPr>
+                      <a:xfrm>
+                        <a:off x="0" y="0"/>
+                        <a:ext cx="3931920" cy="688943"/>
+                      </a:xfrm>
+                      <a:prstGeom prst="rect">
+                        <a:avLst/>
+                      </a:prstGeom>
+                    </wps:spPr>
+                    <wps:txbx>
+                      <w:txbxContent>
+                        <w:p>
+                          <w:pPr>
+                            <w:spacing w:before="14"/>
+                            <w:ind w:left="20"/>
+                            <w:jc w:val="center"/>
+                            <w:rPr>
+                              <w:rFonts w:ascii="Arial" w:hAnsi="Arial"/>
+                              <w:b/>
+                              <w:sz w:val="18"/>
+                            </w:rPr>
+                          </w:pPr>
+                          <w:r>
+                            <w:rPr>
+                              <w:noProof/>
+                            </w:rPr>
+                            <w:drawing>
+                              <wp:inline distT="0" distB="0" distL="0" distR="0" wp14:anchorId="05409C90" wp14:editId="333BE1B1">
+                                <wp:extent cx="880138" cy="676765"/>
+                                <wp:effectExtent l="0" t="0" r="0" b="0"/>
+                                <wp:docPr id="369366990" name="Imagem 7"/>
+                                <wp:cNvGraphicFramePr>
+                                  <a:graphicFrameLocks xmlns:a="http://schemas.openxmlformats.org/drawingml/2006/main" noChangeAspect="1"/>
+                                </wp:cNvGraphicFramePr>
+                                <a:graphic xmlns:a="http://schemas.openxmlformats.org/drawingml/2006/main">
+                                  <a:graphicData uri="http://schemas.openxmlformats.org/drawingml/2006/picture">
+                                    <pic:pic xmlns:pic="http://schemas.openxmlformats.org/drawingml/2006/picture">
+                                      <pic:nvPicPr>
+                                        <pic:cNvPr id="369366990" name=""/>
+                                        <pic:cNvPicPr/>
+                                      </pic:nvPicPr>
+                                      <pic:blipFill>
+                                        <a:blip r:embed="rId1">
+                                          <a:extLst>
+                                            <a:ext uri="{28A0092B-C50C-407E-A947-70E740481C1C}">
+                                              <a14:useLocalDpi xmlns:a14="http://schemas.microsoft.com/office/drawing/2010/main" val="0"/>
+                                            </a:ext>
+                                          </a:extLst>
+                                        </a:blip>
+                                        <a:stretch>
+                                          <a:fillRect/>
+                                        </a:stretch>
+                                      </pic:blipFill>
+                                      <pic:spPr>
+                                        <a:xfrm>
+                                          <a:off x="0" y="0"/>
+                                          <a:ext cx="904504" cy="695501"/>
+                                        </a:xfrm>
+                                        <a:prstGeom prst="rect">
+                                          <a:avLst/>
+                                        </a:prstGeom>
+                                      </pic:spPr>
+                                    </pic:pic>
+                                  </a:graphicData>
+                                </a:graphic>
+                              </wp:inline>
+                            </w:drawing>
+                          </w:r>
+                        </w:p>
+                      </w:txbxContent>
+                    </wps:txbx>
+                    <wps:bodyPr wrap="square" lIns="0" tIns="0" rIns="0" bIns="0" rtlCol="0">
+                      <a:noAutofit/>
+                    </wps:bodyPr>
+                  </wps:wsp>
+                </a:graphicData>
+              </a:graphic>
+              <wp14:sizeRelV relativeFrom="margin">
+                <wp14:pctHeight>0</wp14:pctHeight>
+              </wp14:sizeRelV>
+            </wp:anchor>
+          </w:drawing>
+        </mc:Choice>
+        <mc:Fallback>
+          <w:pict>
+            <v:shapetype w14:anchorId="2AAC5969" id="_x0000_t202" coordsize="21600,21600" o:spt="202" path="m,l,21600r21600,l21600,xe">
+              <v:stroke joinstyle="miter"/>
+              <v:path gradientshapeok="t" o:connecttype="rect"/>
+            </v:shapetype>
+            <v:shape id="Textbox 4" o:spid="_x0000_s1026" type="#_x0000_t202" style="position:absolute;margin-left:195.05pt;margin-top:16.4pt;width:309.6pt;height:54.25pt;z-index:-15870976;visibility:visible;mso-wrap-style:square;mso-height-percent:0;mso-wrap-distance-left:0;mso-wrap-distance-top:0;mso-wrap-distance-right:0;mso-wrap-distance-bottom:0;mso-position-horizontal:absolute;mso-position-horizontal-relative:page;mso-position-vertical:absolute;mso-position-vertical-relative:page;mso-height-percent:0;mso-height-relative:margin;v-text-anchor:top" o:gfxdata="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" filled="f" stroked="f">
+              <v:textbox inset="0,0,0,0">
+                <w:txbxContent>
+                  <w:p>
+                    <w:pPr>
+                      <w:spacing w:before="14"/>
+                      <w:ind w:left="20"/>
+                      <w:jc w:val="center"/>
+                      <w:rPr>
+                        <w:rFonts w:ascii="Arial" w:hAnsi="Arial"/>
+                        <w:b/>
+                        <w:sz w:val="18"/>
+                      </w:rPr>
+                    </w:pPr>
+                    <w:r>
+                      <w:rPr>
+                        <w:noProof/>
+                      </w:rPr>
+                      <w:drawing>
+                        <wp:inline distT="0" distB="0" distL="0" distR="0" wp14:anchorId="05409C90" wp14:editId="333BE1B1">
+                          <wp:extent cx="880138" cy="676765"/>
+                          <wp:effectExtent l="0" t="0" r="0" b="0"/>
+                          <wp:docPr id="369366990" name="Imagem 7"/>
+                          <wp:cNvGraphicFramePr>
+                            <a:graphicFrameLocks xmlns:a="http://schemas.openxmlformats.org/drawingml/2006/main" noChangeAspect="1"/>
+                          </wp:cNvGraphicFramePr>
+                          <a:graphic xmlns:a="http://schemas.openxmlformats.org/drawingml/2006/main">
+                            <a:graphicData uri="http://schemas.openxmlformats.org/drawingml/2006/picture">
+                              <pic:pic xmlns:pic="http://schemas.openxmlformats.org/drawingml/2006/picture">
+                                <pic:nvPicPr>
+                                  <pic:cNvPr id="369366990" name=""/>
+                                  <pic:cNvPicPr/>
+                                </pic:nvPicPr>
+                                <pic:blipFill>
+                                  <a:blip r:embed="rId1">
+                                    <a:extLst>
+                                      <a:ext uri="{28A0092B-C50C-407E-A947-70E740481C1C}">
+                                        <a14:useLocalDpi xmlns:a14="http://schemas.microsoft.com/office/drawing/2010/main" val="0"/>
+                                      </a:ext>
+                                    </a:extLst>
+                                  </a:blip>
+                                  <a:stretch>
+                                    <a:fillRect/>
+                                  </a:stretch>
+                                </pic:blipFill>
+                                <pic:spPr>
+                                  <a:xfrm>
+                                    <a:off x="0" y="0"/>
+                                    <a:ext cx="904504" cy="695501"/>
+                                  </a:xfrm>
+                                  <a:prstGeom prst="rect">
+                                    <a:avLst/>
+                                  </a:prstGeom>
+                                </pic:spPr>
+                              </pic:pic>
+                            </a:graphicData>
+                          </a:graphic>
+                        </wp:inline>
+                      </w:drawing>
+                    </w:r>
+                  </w:p>
+                </w:txbxContent>
+              </v:textbox>
+              <w10:wrap anchorx="page" anchory="page"/>
+            </v:shape>
+          </w:pict>
+        </mc:Fallback>
+      </mc:AlternateContent>
+    </w:r>
+    <w:r>
+      <w:rPr>
+        <w:noProof/>
+      </w:rPr>
+      <mc:AlternateContent>
         <mc:Choice Requires="wpg">
           <w:drawing>
-            <wp:anchor distT="0" distB="0" distL="0" distR="0" simplePos="0" relativeHeight="487446016" behindDoc="1" locked="0" layoutInCell="1" allowOverlap="1" wp14:anchorId="1F5B48A1" wp14:editId="6F96B7C3">
+            <wp:anchor distT="0" distB="0" distL="0" distR="0" simplePos="0" relativeHeight="487444992" behindDoc="1" locked="0" layoutInCell="1" allowOverlap="1" wp14:anchorId="1F5B48A1" wp14:editId="0451CD83">
               <wp:simplePos x="0" y="0"/>
               <wp:positionH relativeFrom="page">
-                <wp:posOffset>522731</wp:posOffset>
+                <wp:posOffset>520861</wp:posOffset>
               </wp:positionH>
               <wp:positionV relativeFrom="page">
-                <wp:posOffset>207644</wp:posOffset>
+                <wp:posOffset>208344</wp:posOffset>
               </wp:positionV>
-              <wp:extent cx="6519545" cy="793750"/>
+              <wp:extent cx="6519545" cy="793749"/>
               <wp:effectExtent l="0" t="0" r="0" b="0"/>
               <wp:wrapNone/>
               <wp:docPr id="1" name="Group 1"/>
@@ -7683,9 +7760,9 @@
                     <wpg:grpSpPr>
                       <a:xfrm>
                         <a:off x="0" y="0"/>
-                        <a:ext cx="6519545" cy="793750"/>
+                        <a:ext cx="6519545" cy="793749"/>
                         <a:chOff x="0" y="0"/>
-                        <a:chExt cx="6519545" cy="793750"/>
+                        <a:chExt cx="6519545" cy="793749"/>
                       </a:xfrm>
                     </wpg:grpSpPr>
                     <wps:wsp>
@@ -7740,14 +7817,14 @@
                         <pic:cNvPicPr/>
                       </pic:nvPicPr>
                       <pic:blipFill>
-                        <a:blip r:embed="rId1" cstate="print"/>
+                        <a:blip r:embed="rId2" cstate="print"/>
                         <a:stretch>
                           <a:fillRect/>
                         </a:stretch>
                       </pic:blipFill>
                       <pic:spPr>
                         <a:xfrm>
-                          <a:off x="116712" y="0"/>
+                          <a:off x="0" y="0"/>
                           <a:ext cx="1691225" cy="763904"/>
                         </a:xfrm>
                         <a:prstGeom prst="rect">
@@ -7763,8 +7840,8 @@
         </mc:Choice>
         <mc:Fallback>
           <w:pict>
-            <v:group w14:anchorId="179B8AFB" id="Group 1" o:spid="_x0000_s1026" style="position:absolute;margin-left:41.15pt;margin-top:16.35pt;width:513.35pt;height:62.5pt;z-index:-15870464;mso-wrap-distance-left:0;mso-wrap-distance-right:0;mso-position-horizontal-relative:page;mso-position-vertical-relative:page" coordsize="65195,7937" o:gfxdata="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">
-              <v:shape id="Graphic 2" o:spid="_x0000_s1027" style="position:absolute;top:7753;width:65195;height:184;visibility:visible;mso-wrap-style:square;v-text-anchor:top" coordsize="6519545,18415" o:gfxdata="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" path="m6519418,l,,,18288r6519418,l6519418,xe" fillcolor="black" stroked="f">
+            <v:group w14:anchorId="6A0F78DF" id="Group 1" o:spid="_x0000_s1026" style="position:absolute;margin-left:41pt;margin-top:16.4pt;width:513.35pt;height:62.5pt;z-index:-15871488;mso-wrap-distance-left:0;mso-wrap-distance-right:0;mso-position-horizontal-relative:page;mso-position-vertical-relative:page" coordsize="65195,7937" o:gfxdata="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">
+              <v:shape id="Graphic 2" o:spid="_x0000_s1027" style="position:absolute;top:7753;width:65195;height:184;visibility:visible;mso-wrap-style:square;v-text-anchor:top" coordsize="6519545,18415" o:gfxdata="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" path="m6519418,l,,,18288r6519418,l6519418,xe" fillcolor="black" stroked="f">
                 <v:path arrowok="t"/>
               </v:shape>
               <v:shapetype id="_x0000_t75" coordsize="21600,21600" o:spt="75" o:preferrelative="t" path="m@4@5l@4@11@9@11@9@5xe" filled="f" stroked="f">
@@ -7786,8 +7863,8 @@
                 <v:path o:extrusionok="f" gradientshapeok="t" o:connecttype="rect"/>
                 <o:lock v:ext="edit" aspectratio="t"/>
               </v:shapetype>
-              <v:shape id="Image 3" o:spid="_x0000_s1028" type="#_x0000_t75" style="position:absolute;left:1167;width:16912;height:7639;visibility:visible;mso-wrap-style:square" o:gfxdata="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">
-                <v:imagedata r:id="rId2" o:title=""/>
+              <v:shape id="Image 3" o:spid="_x0000_s1028" type="#_x0000_t75" style="position:absolute;width:16912;height:7639;visibility:visible;mso-wrap-style:square" o:gfxdata="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">
+                <v:imagedata r:id="rId3" o:title=""/>
               </v:shape>
               <w10:wrap anchorx="page" anchory="page"/>
             </v:group>
@@ -7795,6 +7872,30 @@
         </mc:Fallback>
       </mc:AlternateContent>
     </w:r>
+  </w:p>
+</w:hdr>
+</file>
+
+<file path=word/header3.xml><?xml version="1.0" encoding="utf-8"?>
+<w:hdr xmlns:wpc="http://schemas.microsoft.com/office/word/2010/wordprocessingCanvas" xmlns:cx="http://schemas.microsoft.com/office/drawing/2014/chartex" xmlns:cx1="http://schemas.microsoft.com/office/drawing/2015/9/8/chartex" xmlns:cx2="http://schemas.microsoft.com/office/drawing/2015/10/21/chartex" xmlns:cx3="http://schemas.microsoft.com/office/drawing/2016/5/9/chartex" xmlns:cx4="http://schemas.microsoft.com/office/drawing/2016/5/10/chartex" xmlns:cx5="http://schemas.microsoft.com/office/drawing/2016/5/11/chartex" xmlns:cx6="http://schemas.microsoft.com/office/drawing/2016/5/12/chartex" xmlns:cx7="http://schemas.microsoft.com/office/drawing/2016/5/13/chartex" xmlns:cx8="http://schemas.microsoft.com/office/drawing/2016/5/14/chartex" xmlns:mc="http://schemas.openxmlformats.org/markup-compatibility/2006" xmlns:aink="http://schemas.microsoft.com/office/drawing/2016/ink" xmlns:am3d="http://schemas.microsoft.com/office/drawing/2017/model3d" xmlns:o="urn:schemas-microsoft-com:office:office" xmlns:oel="http://schemas.microsoft.com/office/2019/extlst" xmlns:r="http://schemas.openxmlformats.org/officeDocument/2006/relationships" xmlns:m="http://schemas.openxmlformats.org/officeDocument/2006/math" xmlns:v="urn:schemas-microsoft-com:vml" xmlns:wp14="http://schemas.microsoft.com/office/word/2010/wordprocessingDrawing" xmlns:wp="http://schemas.openxmlformats.org/drawingml/2006/wordprocessingDrawing" xmlns:w10="urn:schemas-microsoft-com:office:word" xmlns:w="http://schemas.openxmlformats.org/wordprocessingml/2006/main" xmlns:w14="http://schemas.microsoft.com/office/word/2010/wordml" xmlns:w15="http://schemas.microsoft.com/office/word/2012/wordml" xmlns:w16cex="http://schemas.microsoft.com/office/word/2018/wordml/cex" xmlns:w16cid="http://schemas.microsoft.com/office/word/2016/wordml/cid" xmlns:w16="http://schemas.microsoft.com/office/word/2018/wordml" xmlns:w16du="http://schemas.microsoft.com/office/word/2023/wordml/word16du" xmlns:w16sdtdh="http://schemas.microsoft.com/office/word/2020/wordml/sdtdatahash" xmlns:w16sdtfl="http://schemas.microsoft.com/office/word/2024/wordml/sdtformatlock" xmlns:w16se="http://schemas.microsoft.com/office/word/2015/wordml/symex" xmlns:wpg="http://schemas.microsoft.com/office/word/2010/wordprocessingGroup" xmlns:wpi="http://schemas.microsoft.com/office/word/2010/wordprocessingInk" xmlns:wne="http://schemas.microsoft.com/office/word/2006/wordml" xmlns:wps="http://schemas.microsoft.com/office/word/2010/wordprocessingShape" mc:Ignorable="w14 w15 w16se w16cid w16 w16cex w16sdtdh w16sdtfl w16du wp14">
+  <w:p>
+    <w:pPr>
+      <w:pStyle w:val="Cabealho"/>
+    </w:pPr>
+  </w:p>
+</w:hdr>
+</file>
+
+<file path=word/header4.xml><?xml version="1.0" encoding="utf-8"?>
+<w:hdr xmlns:wpc="http://schemas.microsoft.com/office/word/2010/wordprocessingCanvas" xmlns:cx="http://schemas.microsoft.com/office/drawing/2014/chartex" xmlns:cx1="http://schemas.microsoft.com/office/drawing/2015/9/8/chartex" xmlns:cx2="http://schemas.microsoft.com/office/drawing/2015/10/21/chartex" xmlns:cx3="http://schemas.microsoft.com/office/drawing/2016/5/9/chartex" xmlns:cx4="http://schemas.microsoft.com/office/drawing/2016/5/10/chartex" xmlns:cx5="http://schemas.microsoft.com/office/drawing/2016/5/11/chartex" xmlns:cx6="http://schemas.microsoft.com/office/drawing/2016/5/12/chartex" xmlns:cx7="http://schemas.microsoft.com/office/drawing/2016/5/13/chartex" xmlns:cx8="http://schemas.microsoft.com/office/drawing/2016/5/14/chartex" xmlns:mc="http://schemas.openxmlformats.org/markup-compatibility/2006" xmlns:aink="http://schemas.microsoft.com/office/drawing/2016/ink" xmlns:am3d="http://schemas.microsoft.com/office/drawing/2017/model3d" xmlns:o="urn:schemas-microsoft-com:office:office" xmlns:oel="http://schemas.microsoft.com/office/2019/extlst" xmlns:r="http://schemas.openxmlformats.org/officeDocument/2006/relationships" xmlns:m="http://schemas.openxmlformats.org/officeDocument/2006/math" xmlns:v="urn:schemas-microsoft-com:vml" xmlns:wp14="http://schemas.microsoft.com/office/word/2010/wordprocessingDrawing" xmlns:wp="http://schemas.openxmlformats.org/drawingml/2006/wordprocessingDrawing" xmlns:w10="urn:schemas-microsoft-com:office:word" xmlns:w="http://schemas.openxmlformats.org/wordprocessingml/2006/main" xmlns:w14="http://schemas.microsoft.com/office/word/2010/wordml" xmlns:w15="http://schemas.microsoft.com/office/word/2012/wordml" xmlns:w16cex="http://schemas.microsoft.com/office/word/2018/wordml/cex" xmlns:w16cid="http://schemas.microsoft.com/office/word/2016/wordml/cid" xmlns:w16="http://schemas.microsoft.com/office/word/2018/wordml" xmlns:w16du="http://schemas.microsoft.com/office/word/2023/wordml/word16du" xmlns:w16sdtdh="http://schemas.microsoft.com/office/word/2020/wordml/sdtdatahash" xmlns:w16sdtfl="http://schemas.microsoft.com/office/word/2024/wordml/sdtformatlock" xmlns:w16se="http://schemas.microsoft.com/office/word/2015/wordml/symex" xmlns:wpg="http://schemas.microsoft.com/office/word/2010/wordprocessingGroup" xmlns:wpi="http://schemas.microsoft.com/office/word/2010/wordprocessingInk" xmlns:wne="http://schemas.microsoft.com/office/word/2006/wordml" xmlns:wps="http://schemas.microsoft.com/office/word/2010/wordprocessingShape" mc:Ignorable="w14 w15 w16se w16cid w16 w16cex w16sdtdh w16sdtfl w16du wp14">
+  <w:p>
+    <w:pPr>
+      <w:pStyle w:val="Corpodetexto"/>
+      <w:spacing w:line="14" w:lineRule="auto"/>
+      <w:rPr>
+        <w:sz w:val="20"/>
+      </w:rPr>
+    </w:pPr>
     <w:r>
       <w:rPr>
         <w:noProof/>
@@ -7802,7 +7903,7 @@
       <mc:AlternateContent>
         <mc:Choice Requires="wps">
           <w:drawing>
-            <wp:anchor distT="0" distB="0" distL="0" distR="0" simplePos="0" relativeHeight="487446528" behindDoc="1" locked="0" layoutInCell="1" allowOverlap="1" wp14:anchorId="2AAC5969" wp14:editId="04149939">
+            <wp:anchor distT="0" distB="0" distL="0" distR="0" simplePos="0" relativeHeight="487449600" behindDoc="1" locked="0" layoutInCell="1" allowOverlap="1" wp14:anchorId="3EBECDAF" wp14:editId="0F4E2411">
               <wp:simplePos x="0" y="0"/>
               <wp:positionH relativeFrom="page">
                 <wp:posOffset>2472054</wp:posOffset>
@@ -7813,7 +7914,7 @@
               <wp:extent cx="3932554" cy="548005"/>
               <wp:effectExtent l="0" t="0" r="0" b="0"/>
               <wp:wrapNone/>
-              <wp:docPr id="4" name="Textbox 4"/>
+              <wp:docPr id="195031088" name="Textbox 4"/>
               <wp:cNvGraphicFramePr>
                 <a:graphicFrameLocks xmlns:a="http://schemas.openxmlformats.org/drawingml/2006/main"/>
               </wp:cNvGraphicFramePr>
@@ -7844,36 +7945,102 @@
                               <w:sz w:val="18"/>
                             </w:rPr>
                           </w:pPr>
-                          <w:r>
-                            <w:rPr>
-                              <w:rFonts w:ascii="Arial" w:hAnsi="Arial"/>
-                              <w:b/>
-                              <w:sz w:val="18"/>
-                            </w:rPr>
-                            <w:t>Ministério</w:t>
-                          </w:r>
-                          <w:r>
-                            <w:rPr>
-                              <w:rFonts w:ascii="Arial" w:hAnsi="Arial"/>
-                              <w:b/>
-                              <w:spacing w:val="-4"/>
-                              <w:sz w:val="18"/>
-                            </w:rPr>
-                            <w:t xml:space="preserve"> </w:t>
-                          </w:r>
-                          <w:r>
-                            <w:rPr>
-                              <w:rFonts w:ascii="Arial" w:hAnsi="Arial"/>
-                              <w:b/>
-                              <w:sz w:val="18"/>
-                            </w:rPr>
-                            <w:t>do Trabalho e Emprego</w:t>
-                          </w:r>
                         </w:p>
+                      </w:txbxContent>
+                    </wps:txbx>
+                    <wps:bodyPr wrap="square" lIns="0" tIns="0" rIns="0" bIns="0" rtlCol="0">
+                      <a:noAutofit/>
+                    </wps:bodyPr>
+                  </wps:wsp>
+                </a:graphicData>
+              </a:graphic>
+              <wp14:sizeRelV relativeFrom="margin">
+                <wp14:pctHeight>0</wp14:pctHeight>
+              </wp14:sizeRelV>
+            </wp:anchor>
+          </w:drawing>
+        </mc:Choice>
+        <mc:Fallback>
+          <w:pict>
+            <v:shapetype w14:anchorId="3EBECDAF" id="_x0000_t202" coordsize="21600,21600" o:spt="202" path="m,l,21600r21600,l21600,xe">
+              <v:stroke joinstyle="miter"/>
+              <v:path gradientshapeok="t" o:connecttype="rect"/>
+            </v:shapetype>
+            <v:shape id="_x0000_s1027" type="#_x0000_t202" style="position:absolute;margin-left:194.65pt;margin-top:24.7pt;width:309.65pt;height:43.15pt;z-index:-15866880;visibility:visible;mso-wrap-style:square;mso-height-percent:0;mso-wrap-distance-left:0;mso-wrap-distance-top:0;mso-wrap-distance-right:0;mso-wrap-distance-bottom:0;mso-position-horizontal:absolute;mso-position-horizontal-relative:page;mso-position-vertical:absolute;mso-position-vertical-relative:page;mso-height-percent:0;mso-height-relative:margin;v-text-anchor:top" o:gfxdata="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" filled="f" stroked="f">
+              <v:textbox inset="0,0,0,0">
+                <w:txbxContent>
+                  <w:p>
+                    <w:pPr>
+                      <w:spacing w:before="14"/>
+                      <w:ind w:left="20"/>
+                      <w:rPr>
+                        <w:rFonts w:ascii="Arial" w:hAnsi="Arial"/>
+                        <w:b/>
+                        <w:sz w:val="18"/>
+                      </w:rPr>
+                    </w:pPr>
+                  </w:p>
+                </w:txbxContent>
+              </v:textbox>
+              <w10:wrap anchorx="page" anchory="page"/>
+            </v:shape>
+          </w:pict>
+        </mc:Fallback>
+      </mc:AlternateContent>
+    </w:r>
+  </w:p>
+  <w:p>
+    <w:pPr>
+      <w:pStyle w:val="Corpodetexto"/>
+      <w:spacing w:line="14" w:lineRule="auto"/>
+      <w:rPr>
+        <w:sz w:val="20"/>
+      </w:rPr>
+    </w:pPr>
+    <w:r>
+      <w:rPr>
+        <w:noProof/>
+      </w:rPr>
+      <mc:AlternateContent>
+        <mc:Choice Requires="wps">
+          <w:drawing>
+            <wp:anchor distT="0" distB="0" distL="0" distR="0" simplePos="0" relativeHeight="487452672" behindDoc="1" locked="0" layoutInCell="1" allowOverlap="1" wp14:anchorId="358D9E94" wp14:editId="15096D02">
+              <wp:simplePos x="0" y="0"/>
+              <wp:positionH relativeFrom="page">
+                <wp:posOffset>2476982</wp:posOffset>
+              </wp:positionH>
+              <wp:positionV relativeFrom="page">
+                <wp:posOffset>208344</wp:posOffset>
+              </wp:positionV>
+              <wp:extent cx="3931920" cy="688943"/>
+              <wp:effectExtent l="0" t="0" r="0" b="0"/>
+              <wp:wrapNone/>
+              <wp:docPr id="91025808" name="Textbox 4"/>
+              <wp:cNvGraphicFramePr>
+                <a:graphicFrameLocks xmlns:a="http://schemas.openxmlformats.org/drawingml/2006/main"/>
+              </wp:cNvGraphicFramePr>
+              <a:graphic xmlns:a="http://schemas.openxmlformats.org/drawingml/2006/main">
+                <a:graphicData uri="http://schemas.microsoft.com/office/word/2010/wordprocessingShape">
+                  <wps:wsp>
+                    <wps:cNvSpPr txBox="1">
+                      <a:spLocks/>
+                    </wps:cNvSpPr>
+                    <wps:spPr>
+                      <a:xfrm>
+                        <a:off x="0" y="0"/>
+                        <a:ext cx="3931920" cy="688943"/>
+                      </a:xfrm>
+                      <a:prstGeom prst="rect">
+                        <a:avLst/>
+                      </a:prstGeom>
+                    </wps:spPr>
+                    <wps:txbx>
+                      <w:txbxContent>
                         <w:p>
                           <w:pPr>
                             <w:spacing w:before="14"/>
                             <w:ind w:left="20"/>
+                            <w:jc w:val="center"/>
                             <w:rPr>
                               <w:rFonts w:ascii="Arial" w:hAnsi="Arial"/>
                               <w:b/>
@@ -7882,124 +8049,49 @@
                           </w:pPr>
                           <w:r>
                             <w:rPr>
-                              <w:rFonts w:ascii="Arial" w:hAnsi="Arial"/>
-                              <w:b/>
-                              <w:sz w:val="18"/>
+                              <w:noProof/>
                             </w:rPr>
-                            <w:t>Secretaria</w:t>
-                          </w:r>
-                          <w:r>
-                            <w:rPr>
-                              <w:rFonts w:ascii="Arial" w:hAnsi="Arial"/>
-                              <w:b/>
-                              <w:spacing w:val="-4"/>
-                              <w:sz w:val="18"/>
-                            </w:rPr>
-                            <w:t xml:space="preserve"> </w:t>
-                          </w:r>
-                          <w:r>
-                            <w:rPr>
-                              <w:rFonts w:ascii="Arial" w:hAnsi="Arial"/>
-                              <w:b/>
-                              <w:sz w:val="18"/>
-                            </w:rPr>
-                            <w:t xml:space="preserve">de </w:t>
-                          </w:r>
-                          <w:r>
-                            <w:rPr>
-                              <w:rFonts w:ascii="Arial" w:hAnsi="Arial"/>
-                              <w:b/>
-                              <w:sz w:val="18"/>
-                            </w:rPr>
-                            <w:t>Inspeção</w:t>
-                          </w:r>
-                          <w:r>
-                            <w:rPr>
-                              <w:rFonts w:ascii="Arial" w:hAnsi="Arial"/>
-                              <w:b/>
-                              <w:sz w:val="18"/>
-                            </w:rPr>
-                            <w:t xml:space="preserve"> do</w:t>
-                          </w:r>
-                          <w:r>
-                            <w:rPr>
-                              <w:rFonts w:ascii="Arial" w:hAnsi="Arial"/>
-                              <w:b/>
-                              <w:spacing w:val="-6"/>
-                              <w:sz w:val="18"/>
-                            </w:rPr>
-                            <w:t xml:space="preserve"> </w:t>
-                          </w:r>
-                          <w:r>
-                            <w:rPr>
-                              <w:rFonts w:ascii="Arial" w:hAnsi="Arial"/>
-                              <w:b/>
-                              <w:sz w:val="18"/>
-                            </w:rPr>
-                            <w:t xml:space="preserve">Trabalho </w:t>
-                          </w:r>
-                        </w:p>
-                        <w:p>
-                          <w:pPr>
-                            <w:spacing w:before="14"/>
-                            <w:ind w:left="20"/>
-                            <w:rPr>
-                              <w:rFonts w:ascii="Arial" w:hAnsi="Arial"/>
-                              <w:b/>
-                              <w:sz w:val="18"/>
-                            </w:rPr>
-                          </w:pPr>
-                          <w:r>
-                            <w:rPr>
-                              <w:rFonts w:ascii="Arial" w:hAnsi="Arial"/>
-                              <w:b/>
-                              <w:sz w:val="18"/>
-                            </w:rPr>
-                            <w:t>Superintendência</w:t>
-                          </w:r>
-                          <w:r>
-                            <w:rPr>
-                              <w:rFonts w:ascii="Arial" w:hAnsi="Arial"/>
-                              <w:b/>
-                              <w:spacing w:val="40"/>
-                              <w:sz w:val="18"/>
-                            </w:rPr>
-                            <w:t xml:space="preserve"> </w:t>
-                          </w:r>
-                          <w:r>
-                            <w:rPr>
-                              <w:rFonts w:ascii="Arial" w:hAnsi="Arial"/>
-                              <w:b/>
-                              <w:sz w:val="18"/>
-                            </w:rPr>
-                            <w:t xml:space="preserve">Regional do Trabalho no Estado de </w:t>
-                          </w:r>
-                          <w:r>
-                            <w:rPr>
-                              <w:rFonts w:ascii="Arial" w:hAnsi="Arial"/>
-                              <w:b/>
-                              <w:sz w:val="18"/>
-                            </w:rPr>
-                            <w:t>Goiás</w:t>
-                          </w:r>
-                        </w:p>
-                        <w:p>
-                          <w:pPr>
-                            <w:spacing w:before="14"/>
-                            <w:ind w:left="20"/>
-                            <w:rPr>
-                              <w:rFonts w:ascii="Arial" w:hAnsi="Arial"/>
-                              <w:b/>
-                              <w:sz w:val="18"/>
-                            </w:rPr>
-                          </w:pPr>
-                          <w:r>
-                            <w:rPr>
-                              <w:rFonts w:ascii="Arial" w:hAnsi="Arial"/>
-                              <w:b/>
-                              <w:sz w:val="18"/>
-                            </w:rPr>
-                            <w:t>Setor de Inspeção do Trabalho</w:t>
+                            <w:drawing>
+                              <wp:inline distT="0" distB="0" distL="0" distR="0" wp14:anchorId="32F1A880" wp14:editId="7BD9FB81">
+                                <wp:extent cx="880138" cy="676765"/>
+                                <wp:effectExtent l="0" t="0" r="0" b="0"/>
+                                <wp:docPr id="2098197581" name="Imagem 7"/>
+                                <wp:cNvGraphicFramePr>
+                                  <a:graphicFrameLocks xmlns:a="http://schemas.openxmlformats.org/drawingml/2006/main" noChangeAspect="1"/>
+                                </wp:cNvGraphicFramePr>
+                                <a:graphic xmlns:a="http://schemas.openxmlformats.org/drawingml/2006/main">
+                                  <a:graphicData uri="http://schemas.openxmlformats.org/drawingml/2006/picture">
+                                    <pic:pic xmlns:pic="http://schemas.openxmlformats.org/drawingml/2006/picture">
+                                      <pic:nvPicPr>
+                                        <pic:cNvPr id="369366990" name=""/>
+                                        <pic:cNvPicPr/>
+                                      </pic:nvPicPr>
+                                      <pic:blipFill>
+                                        <a:blip r:embed="rId1">
+                                          <a:extLst>
+                                            <a:ext uri="{28A0092B-C50C-407E-A947-70E740481C1C}">
+                                              <a14:useLocalDpi xmlns:a14="http://schemas.microsoft.com/office/drawing/2010/main" val="0"/>
+                                            </a:ext>
+                                          </a:extLst>
+                                        </a:blip>
+                                        <a:stretch>
+                                          <a:fillRect/>
+                                        </a:stretch>
+                                      </pic:blipFill>
+                                      <pic:spPr>
+                                        <a:xfrm>
+                                          <a:off x="0" y="0"/>
+                                          <a:ext cx="904504" cy="695501"/>
+                                        </a:xfrm>
+                                        <a:prstGeom prst="rect">
+                                          <a:avLst/>
+                                        </a:prstGeom>
+                                      </pic:spPr>
+                                    </pic:pic>
+                                  </a:graphicData>
+                                </a:graphic>
+                              </wp:inline>
+                            </w:drawing>
                           </w:r>
                         </w:p>
                       </w:txbxContent>
@@ -8018,17 +8110,14 @@
         </mc:Choice>
         <mc:Fallback>
           <w:pict>
-            <v:shapetype w14:anchorId="2AAC5969" id="_x0000_t202" coordsize="21600,21600" o:spt="202" path="m,l,21600r21600,l21600,xe">
-              <v:stroke joinstyle="miter"/>
-              <v:path gradientshapeok="t" o:connecttype="rect"/>
-            </v:shapetype>
-            <v:shape id="Textbox 4" o:spid="_x0000_s1026" type="#_x0000_t202" style="position:absolute;margin-left:194.65pt;margin-top:24.7pt;width:309.65pt;height:43.15pt;z-index:-15869952;visibility:visible;mso-wrap-style:square;mso-height-percent:0;mso-wrap-distance-left:0;mso-wrap-distance-top:0;mso-wrap-distance-right:0;mso-wrap-distance-bottom:0;mso-position-horizontal:absolute;mso-position-horizontal-relative:page;mso-position-vertical:absolute;mso-position-vertical-relative:page;mso-height-percent:0;mso-height-relative:margin;v-text-anchor:top" o:gfxdata="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" filled="f" stroked="f">
+            <v:shape w14:anchorId="358D9E94" id="_x0000_s1028" type="#_x0000_t202" style="position:absolute;margin-left:195.05pt;margin-top:16.4pt;width:309.6pt;height:54.25pt;z-index:-15863808;visibility:visible;mso-wrap-style:square;mso-height-percent:0;mso-wrap-distance-left:0;mso-wrap-distance-top:0;mso-wrap-distance-right:0;mso-wrap-distance-bottom:0;mso-position-horizontal:absolute;mso-position-horizontal-relative:page;mso-position-vertical:absolute;mso-position-vertical-relative:page;mso-height-percent:0;mso-height-relative:margin;v-text-anchor:top" o:gfxdata="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" filled="f" stroked="f">
               <v:textbox inset="0,0,0,0">
                 <w:txbxContent>
                   <w:p>
                     <w:pPr>
                       <w:spacing w:before="14"/>
                       <w:ind w:left="20"/>
+                      <w:jc w:val="center"/>
                       <w:rPr>
                         <w:rFonts w:ascii="Arial" w:hAnsi="Arial"/>
                         <w:b/>
@@ -8037,160 +8126,49 @@
                     </w:pPr>
                     <w:r>
                       <w:rPr>
-                        <w:rFonts w:ascii="Arial" w:hAnsi="Arial"/>
-                        <w:b/>
-                        <w:sz w:val="18"/>
+                        <w:noProof/>
                       </w:rPr>
-                      <w:t>Ministério</w:t>
-                    </w:r>
-                    <w:r>
-                      <w:rPr>
-                        <w:rFonts w:ascii="Arial" w:hAnsi="Arial"/>
-                        <w:b/>
-                        <w:spacing w:val="-4"/>
-                        <w:sz w:val="18"/>
-                      </w:rPr>
-                      <w:t xml:space="preserve"> </w:t>
-                    </w:r>
-                    <w:r>
-                      <w:rPr>
-                        <w:rFonts w:ascii="Arial" w:hAnsi="Arial"/>
-                        <w:b/>
-                        <w:sz w:val="18"/>
-                      </w:rPr>
-                      <w:t>do Trabalho e Emprego</w:t>
-                    </w:r>
-                  </w:p>
-                  <w:p>
-                    <w:pPr>
-                      <w:spacing w:before="14"/>
-                      <w:ind w:left="20"/>
-                      <w:rPr>
-                        <w:rFonts w:ascii="Arial" w:hAnsi="Arial"/>
-                        <w:b/>
-                        <w:sz w:val="18"/>
-                      </w:rPr>
-                    </w:pPr>
-                    <w:r>
-                      <w:rPr>
-                        <w:rFonts w:ascii="Arial" w:hAnsi="Arial"/>
-                        <w:b/>
-                        <w:sz w:val="18"/>
-                      </w:rPr>
-                      <w:t>Secretaria</w:t>
-                    </w:r>
-                    <w:r>
-                      <w:rPr>
-                        <w:rFonts w:ascii="Arial" w:hAnsi="Arial"/>
-                        <w:b/>
-                        <w:spacing w:val="-4"/>
-                        <w:sz w:val="18"/>
-                      </w:rPr>
-                      <w:t xml:space="preserve"> </w:t>
-                    </w:r>
-                    <w:r>
-                      <w:rPr>
-                        <w:rFonts w:ascii="Arial" w:hAnsi="Arial"/>
-                        <w:b/>
-                        <w:sz w:val="18"/>
-                      </w:rPr>
-                      <w:t xml:space="preserve">de </w:t>
-                    </w:r>
-                    <w:r>
-                      <w:rPr>
-                        <w:rFonts w:ascii="Arial" w:hAnsi="Arial"/>
-                        <w:b/>
-                        <w:sz w:val="18"/>
-                      </w:rPr>
-                      <w:t>Inspeção</w:t>
-                    </w:r>
-                    <w:r>
-                      <w:rPr>
-                        <w:rFonts w:ascii="Arial" w:hAnsi="Arial"/>
-                        <w:b/>
-                        <w:sz w:val="18"/>
-                      </w:rPr>
-                      <w:t xml:space="preserve"> do</w:t>
-                    </w:r>
-                    <w:r>
-                      <w:rPr>
-                        <w:rFonts w:ascii="Arial" w:hAnsi="Arial"/>
-                        <w:b/>
-                        <w:spacing w:val="-6"/>
-                        <w:sz w:val="18"/>
-                      </w:rPr>
-                      <w:t xml:space="preserve"> </w:t>
-                    </w:r>
-                    <w:r>
-                      <w:rPr>
-                        <w:rFonts w:ascii="Arial" w:hAnsi="Arial"/>
-                        <w:b/>
-                        <w:sz w:val="18"/>
-                      </w:rPr>
-                      <w:t xml:space="preserve">Trabalho </w:t>
-                    </w:r>
-                  </w:p>
-                  <w:p>
-                    <w:pPr>
-                      <w:spacing w:before="14"/>
-                      <w:ind w:left="20"/>
-                      <w:rPr>
-                        <w:rFonts w:ascii="Arial" w:hAnsi="Arial"/>
-                        <w:b/>
-                        <w:sz w:val="18"/>
-                      </w:rPr>
-                    </w:pPr>
-                    <w:r>
-                      <w:rPr>
-                        <w:rFonts w:ascii="Arial" w:hAnsi="Arial"/>
-                        <w:b/>
-                        <w:sz w:val="18"/>
-                      </w:rPr>
-                      <w:t>Superintendência</w:t>
-                    </w:r>
-                    <w:r>
-                      <w:rPr>
-                        <w:rFonts w:ascii="Arial" w:hAnsi="Arial"/>
-                        <w:b/>
-                        <w:spacing w:val="40"/>
-                        <w:sz w:val="18"/>
-                      </w:rPr>
-                      <w:t xml:space="preserve"> </w:t>
-                    </w:r>
-                    <w:r>
-                      <w:rPr>
-                        <w:rFonts w:ascii="Arial" w:hAnsi="Arial"/>
-                        <w:b/>
-                        <w:sz w:val="18"/>
-                      </w:rPr>
-                      <w:t xml:space="preserve">Regional do Trabalho no Estado de </w:t>
-                    </w:r>
-                    <w:r>
-                      <w:rPr>
-                        <w:rFonts w:ascii="Arial" w:hAnsi="Arial"/>
-                        <w:b/>
-                        <w:sz w:val="18"/>
-                      </w:rPr>
-                      <w:t>Goiás</w:t>
-                    </w:r>
-                  </w:p>
-                  <w:p>
-                    <w:pPr>
-                      <w:spacing w:before="14"/>
-                      <w:ind w:left="20"/>
-                      <w:rPr>
-                        <w:rFonts w:ascii="Arial" w:hAnsi="Arial"/>
-                        <w:b/>
-                        <w:sz w:val="18"/>
-                      </w:rPr>
-                    </w:pPr>
-                    <w:r>
-                      <w:rPr>
-                        <w:rFonts w:ascii="Arial" w:hAnsi="Arial"/>
-                        <w:b/>
-                        <w:sz w:val="18"/>
-                      </w:rPr>
-                      <w:t>Setor de Inspeção do Trabalho</w:t>
+                      <w:drawing>
+                        <wp:inline distT="0" distB="0" distL="0" distR="0" wp14:anchorId="32F1A880" wp14:editId="7BD9FB81">
+                          <wp:extent cx="880138" cy="676765"/>
+                          <wp:effectExtent l="0" t="0" r="0" b="0"/>
+                          <wp:docPr id="2098197581" name="Imagem 7"/>
+                          <wp:cNvGraphicFramePr>
+                            <a:graphicFrameLocks xmlns:a="http://schemas.openxmlformats.org/drawingml/2006/main" noChangeAspect="1"/>
+                          </wp:cNvGraphicFramePr>
+                          <a:graphic xmlns:a="http://schemas.openxmlformats.org/drawingml/2006/main">
+                            <a:graphicData uri="http://schemas.openxmlformats.org/drawingml/2006/picture">
+                              <pic:pic xmlns:pic="http://schemas.openxmlformats.org/drawingml/2006/picture">
+                                <pic:nvPicPr>
+                                  <pic:cNvPr id="369366990" name=""/>
+                                  <pic:cNvPicPr/>
+                                </pic:nvPicPr>
+                                <pic:blipFill>
+                                  <a:blip r:embed="rId1">
+                                    <a:extLst>
+                                      <a:ext uri="{28A0092B-C50C-407E-A947-70E740481C1C}">
+                                        <a14:useLocalDpi xmlns:a14="http://schemas.microsoft.com/office/drawing/2010/main" val="0"/>
+                                      </a:ext>
+                                    </a:extLst>
+                                  </a:blip>
+                                  <a:stretch>
+                                    <a:fillRect/>
+                                  </a:stretch>
+                                </pic:blipFill>
+                                <pic:spPr>
+                                  <a:xfrm>
+                                    <a:off x="0" y="0"/>
+                                    <a:ext cx="904504" cy="695501"/>
+                                  </a:xfrm>
+                                  <a:prstGeom prst="rect">
+                                    <a:avLst/>
+                                  </a:prstGeom>
+                                </pic:spPr>
+                              </pic:pic>
+                            </a:graphicData>
+                          </a:graphic>
+                        </wp:inline>
+                      </w:drawing>
                     </w:r>
                   </w:p>
                 </w:txbxContent>
@@ -8201,20 +8179,6 @@
         </mc:Fallback>
       </mc:AlternateContent>
     </w:r>
-  </w:p>
-</w:hdr>
-</file>
-
-<file path=word/header2.xml><?xml version="1.0" encoding="utf-8"?>
-<w:hdr xmlns:wpc="http://schemas.microsoft.com/office/word/2010/wordprocessingCanvas" xmlns:cx="http://schemas.microsoft.com/office/drawing/2014/chartex" xmlns:cx1="http://schemas.microsoft.com/office/drawing/2015/9/8/chartex" xmlns:cx2="http://schemas.microsoft.com/office/drawing/2015/10/21/chartex" xmlns:cx3="http://schemas.microsoft.com/office/drawing/2016/5/9/chartex" xmlns:cx4="http://schemas.microsoft.com/office/drawing/2016/5/10/chartex" xmlns:cx5="http://schemas.microsoft.com/office/drawing/2016/5/11/chartex" xmlns:cx6="http://schemas.microsoft.com/office/drawing/2016/5/12/chartex" xmlns:cx7="http://schemas.microsoft.com/office/drawing/2016/5/13/chartex" xmlns:cx8="http://schemas.microsoft.com/office/drawing/2016/5/14/chartex" xmlns:mc="http://schemas.openxmlformats.org/markup-compatibility/2006" xmlns:aink="http://schemas.microsoft.com/office/drawing/2016/ink" xmlns:am3d="http://schemas.microsoft.com/office/drawing/2017/model3d" xmlns:o="urn:schemas-microsoft-com:office:office" xmlns:oel="http://schemas.microsoft.com/office/2019/extlst" xmlns:r="http://schemas.openxmlformats.org/officeDocument/2006/relationships" xmlns:m="http://schemas.openxmlformats.org/officeDocument/2006/math" xmlns:v="urn:schemas-microsoft-com:vml" xmlns:wp14="http://schemas.microsoft.com/office/word/2010/wordprocessingDrawing" xmlns:wp="http://schemas.openxmlformats.org/drawingml/2006/wordprocessingDrawing" xmlns:w10="urn:schemas-microsoft-com:office:word" xmlns:w="http://schemas.openxmlformats.org/wordprocessingml/2006/main" xmlns:w14="http://schemas.microsoft.com/office/word/2010/wordml" xmlns:w15="http://schemas.microsoft.com/office/word/2012/wordml" xmlns:w16cex="http://schemas.microsoft.com/office/word/2018/wordml/cex" xmlns:w16cid="http://schemas.microsoft.com/office/word/2016/wordml/cid" xmlns:w16="http://schemas.microsoft.com/office/word/2018/wordml" xmlns:w16du="http://schemas.microsoft.com/office/word/2023/wordml/word16du" xmlns:w16sdtdh="http://schemas.microsoft.com/office/word/2020/wordml/sdtdatahash" xmlns:w16sdtfl="http://schemas.microsoft.com/office/word/2024/wordml/sdtformatlock" xmlns:w16se="http://schemas.microsoft.com/office/word/2015/wordml/symex" xmlns:wpg="http://schemas.microsoft.com/office/word/2010/wordprocessingGroup" xmlns:wpi="http://schemas.microsoft.com/office/word/2010/wordprocessingInk" xmlns:wne="http://schemas.microsoft.com/office/word/2006/wordml" xmlns:wps="http://schemas.microsoft.com/office/word/2010/wordprocessingShape" mc:Ignorable="w14 w15 w16se w16cid w16 w16cex w16sdtdh w16sdtfl w16du wp14">
-  <w:p>
-    <w:pPr>
-      <w:pStyle w:val="Corpodetexto"/>
-      <w:spacing w:line="14" w:lineRule="auto"/>
-      <w:rPr>
-        <w:sz w:val="20"/>
-      </w:rPr>
-    </w:pPr>
     <w:r>
       <w:rPr>
         <w:noProof/>
@@ -8222,18 +8186,18 @@
       <mc:AlternateContent>
         <mc:Choice Requires="wpg">
           <w:drawing>
-            <wp:anchor distT="0" distB="0" distL="0" distR="0" simplePos="0" relativeHeight="487448576" behindDoc="1" locked="0" layoutInCell="1" allowOverlap="1" wp14:anchorId="69B67649" wp14:editId="17E4C74F">
+            <wp:anchor distT="0" distB="0" distL="0" distR="0" simplePos="0" relativeHeight="487451648" behindDoc="1" locked="0" layoutInCell="1" allowOverlap="1" wp14:anchorId="25A7A604" wp14:editId="2B98BB73">
               <wp:simplePos x="0" y="0"/>
               <wp:positionH relativeFrom="page">
-                <wp:posOffset>522731</wp:posOffset>
+                <wp:posOffset>520861</wp:posOffset>
               </wp:positionH>
               <wp:positionV relativeFrom="page">
-                <wp:posOffset>207644</wp:posOffset>
+                <wp:posOffset>208344</wp:posOffset>
               </wp:positionV>
-              <wp:extent cx="6519545" cy="793750"/>
+              <wp:extent cx="6519545" cy="793749"/>
               <wp:effectExtent l="0" t="0" r="0" b="0"/>
               <wp:wrapNone/>
-              <wp:docPr id="47679970" name="Group 1"/>
+              <wp:docPr id="2074420842" name="Group 1"/>
               <wp:cNvGraphicFramePr>
                 <a:graphicFrameLocks xmlns:a="http://schemas.openxmlformats.org/drawingml/2006/main"/>
               </wp:cNvGraphicFramePr>
@@ -8246,13 +8210,13 @@
                     <wpg:grpSpPr>
                       <a:xfrm>
                         <a:off x="0" y="0"/>
-                        <a:ext cx="6519545" cy="793750"/>
+                        <a:ext cx="6519545" cy="793749"/>
                         <a:chOff x="0" y="0"/>
-                        <a:chExt cx="6519545" cy="793750"/>
+                        <a:chExt cx="6519545" cy="793749"/>
                       </a:xfrm>
                     </wpg:grpSpPr>
                     <wps:wsp>
-                      <wps:cNvPr id="1390016745" name="Graphic 2"/>
+                      <wps:cNvPr id="1668740300" name="Graphic 2"/>
                       <wps:cNvSpPr/>
                       <wps:spPr>
                         <a:xfrm>
@@ -8299,18 +8263,18 @@
                     </wps:wsp>
                     <pic:pic xmlns:pic="http://schemas.openxmlformats.org/drawingml/2006/picture">
                       <pic:nvPicPr>
-                        <pic:cNvPr id="348343373" name="Image 3"/>
+                        <pic:cNvPr id="1838502873" name="Image 3"/>
                         <pic:cNvPicPr/>
                       </pic:nvPicPr>
                       <pic:blipFill>
-                        <a:blip r:embed="rId1" cstate="print"/>
+                        <a:blip r:embed="rId2" cstate="print"/>
                         <a:stretch>
                           <a:fillRect/>
                         </a:stretch>
                       </pic:blipFill>
                       <pic:spPr>
                         <a:xfrm>
-                          <a:off x="116712" y="0"/>
+                          <a:off x="0" y="0"/>
                           <a:ext cx="1691225" cy="763904"/>
                         </a:xfrm>
                         <a:prstGeom prst="rect">
@@ -8326,8 +8290,8 @@
         </mc:Choice>
         <mc:Fallback>
           <w:pict>
-            <v:group w14:anchorId="18A9041D" id="Group 1" o:spid="_x0000_s1026" style="position:absolute;margin-left:41.15pt;margin-top:16.35pt;width:513.35pt;height:62.5pt;z-index:-15867904;mso-wrap-distance-left:0;mso-wrap-distance-right:0;mso-position-horizontal-relative:page;mso-position-vertical-relative:page" coordsize="65195,7937" o:gfxdata="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">
-              <v:shape id="Graphic 2" o:spid="_x0000_s1027" style="position:absolute;top:7753;width:65195;height:184;visibility:visible;mso-wrap-style:square;v-text-anchor:top" coordsize="6519545,18415" o:gfxdata="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" path="m6519418,l,,,18288r6519418,l6519418,xe" fillcolor="black" stroked="f">
+            <v:group w14:anchorId="5F0DB035" id="Group 1" o:spid="_x0000_s1026" style="position:absolute;margin-left:41pt;margin-top:16.4pt;width:513.35pt;height:62.5pt;z-index:-15864832;mso-wrap-distance-left:0;mso-wrap-distance-right:0;mso-position-horizontal-relative:page;mso-position-vertical-relative:page" coordsize="65195,7937" o:gfxdata="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">
+              <v:shape id="Graphic 2" o:spid="_x0000_s1027" style="position:absolute;top:7753;width:65195;height:184;visibility:visible;mso-wrap-style:square;v-text-anchor:top" coordsize="6519545,18415" o:gfxdata="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" path="m6519418,l,,,18288r6519418,l6519418,xe" fillcolor="black" stroked="f">
                 <v:path arrowok="t"/>
               </v:shape>
               <v:shapetype id="_x0000_t75" coordsize="21600,21600" o:spt="75" o:preferrelative="t" path="m@4@5l@4@11@9@11@9@5xe" filled="f" stroked="f">
@@ -8349,369 +8313,11 @@
                 <v:path o:extrusionok="f" gradientshapeok="t" o:connecttype="rect"/>
                 <o:lock v:ext="edit" aspectratio="t"/>
               </v:shapetype>
-              <v:shape id="Image 3" o:spid="_x0000_s1028" type="#_x0000_t75" style="position:absolute;left:1167;width:16912;height:7639;visibility:visible;mso-wrap-style:square" o:gfxdata="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">
-                <v:imagedata r:id="rId2" o:title=""/>
+              <v:shape id="Image 3" o:spid="_x0000_s1028" type="#_x0000_t75" style="position:absolute;width:16912;height:7639;visibility:visible;mso-wrap-style:square" o:gfxdata="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">
+                <v:imagedata r:id="rId3" o:title=""/>
               </v:shape>
               <w10:wrap anchorx="page" anchory="page"/>
             </v:group>
-          </w:pict>
-        </mc:Fallback>
-      </mc:AlternateContent>
-    </w:r>
-    <w:r>
-      <w:rPr>
-        <w:noProof/>
-      </w:rPr>
-      <mc:AlternateContent>
-        <mc:Choice Requires="wps">
-          <w:drawing>
-            <wp:anchor distT="0" distB="0" distL="0" distR="0" simplePos="0" relativeHeight="487449600" behindDoc="1" locked="0" layoutInCell="1" allowOverlap="1" wp14:anchorId="3EBECDAF" wp14:editId="38E57DF4">
-              <wp:simplePos x="0" y="0"/>
-              <wp:positionH relativeFrom="page">
-                <wp:posOffset>2472054</wp:posOffset>
-              </wp:positionH>
-              <wp:positionV relativeFrom="page">
-                <wp:posOffset>313594</wp:posOffset>
-              </wp:positionV>
-              <wp:extent cx="3932554" cy="548005"/>
-              <wp:effectExtent l="0" t="0" r="0" b="0"/>
-              <wp:wrapNone/>
-              <wp:docPr id="195031088" name="Textbox 4"/>
-              <wp:cNvGraphicFramePr>
-                <a:graphicFrameLocks xmlns:a="http://schemas.openxmlformats.org/drawingml/2006/main"/>
-              </wp:cNvGraphicFramePr>
-              <a:graphic xmlns:a="http://schemas.openxmlformats.org/drawingml/2006/main">
-                <a:graphicData uri="http://schemas.microsoft.com/office/word/2010/wordprocessingShape">
-                  <wps:wsp>
-                    <wps:cNvSpPr txBox="1">
-                      <a:spLocks/>
-                    </wps:cNvSpPr>
-                    <wps:spPr>
-                      <a:xfrm>
-                        <a:off x="0" y="0"/>
-                        <a:ext cx="3932554" cy="548005"/>
-                      </a:xfrm>
-                      <a:prstGeom prst="rect">
-                        <a:avLst/>
-                      </a:prstGeom>
-                    </wps:spPr>
-                    <wps:txbx>
-                      <w:txbxContent>
-                        <w:p>
-                          <w:pPr>
-                            <w:spacing w:before="14"/>
-                            <w:ind w:left="20"/>
-                            <w:rPr>
-                              <w:rFonts w:ascii="Arial" w:hAnsi="Arial"/>
-                              <w:b/>
-                              <w:sz w:val="18"/>
-                            </w:rPr>
-                          </w:pPr>
-                          <w:r>
-                            <w:rPr>
-                              <w:rFonts w:ascii="Arial" w:hAnsi="Arial"/>
-                              <w:b/>
-                              <w:sz w:val="18"/>
-                            </w:rPr>
-                            <w:t>Ministério</w:t>
-                          </w:r>
-                          <w:r>
-                            <w:rPr>
-                              <w:rFonts w:ascii="Arial" w:hAnsi="Arial"/>
-                              <w:b/>
-                              <w:spacing w:val="-4"/>
-                              <w:sz w:val="18"/>
-                            </w:rPr>
-                            <w:t xml:space="preserve"> </w:t>
-                          </w:r>
-                          <w:r>
-                            <w:rPr>
-                              <w:rFonts w:ascii="Arial" w:hAnsi="Arial"/>
-                              <w:b/>
-                              <w:sz w:val="18"/>
-                            </w:rPr>
-                            <w:t>do Trabalho e Emprego</w:t>
-                          </w:r>
-                        </w:p>
-                        <w:p>
-                          <w:pPr>
-                            <w:spacing w:before="14"/>
-                            <w:ind w:left="20"/>
-                            <w:rPr>
-                              <w:rFonts w:ascii="Arial" w:hAnsi="Arial"/>
-                              <w:b/>
-                              <w:sz w:val="18"/>
-                            </w:rPr>
-                          </w:pPr>
-                          <w:r>
-                            <w:rPr>
-                              <w:rFonts w:ascii="Arial" w:hAnsi="Arial"/>
-                              <w:b/>
-                              <w:sz w:val="18"/>
-                            </w:rPr>
-                            <w:t>Secretaria</w:t>
-                          </w:r>
-                          <w:r>
-                            <w:rPr>
-                              <w:rFonts w:ascii="Arial" w:hAnsi="Arial"/>
-                              <w:b/>
-                              <w:spacing w:val="-4"/>
-                              <w:sz w:val="18"/>
-                            </w:rPr>
-                            <w:t xml:space="preserve"> </w:t>
-                          </w:r>
-                          <w:r>
-                            <w:rPr>
-                              <w:rFonts w:ascii="Arial" w:hAnsi="Arial"/>
-                              <w:b/>
-                              <w:sz w:val="18"/>
-                            </w:rPr>
-                            <w:t>de Inspeção do</w:t>
-                          </w:r>
-                          <w:r>
-                            <w:rPr>
-                              <w:rFonts w:ascii="Arial" w:hAnsi="Arial"/>
-                              <w:b/>
-                              <w:spacing w:val="-6"/>
-                              <w:sz w:val="18"/>
-                            </w:rPr>
-                            <w:t xml:space="preserve"> </w:t>
-                          </w:r>
-                          <w:r>
-                            <w:rPr>
-                              <w:rFonts w:ascii="Arial" w:hAnsi="Arial"/>
-                              <w:b/>
-                              <w:sz w:val="18"/>
-                            </w:rPr>
-                            <w:t xml:space="preserve">Trabalho </w:t>
-                          </w:r>
-                        </w:p>
-                        <w:p>
-                          <w:pPr>
-                            <w:spacing w:before="14"/>
-                            <w:ind w:left="20"/>
-                            <w:rPr>
-                              <w:rFonts w:ascii="Arial" w:hAnsi="Arial"/>
-                              <w:b/>
-                              <w:sz w:val="18"/>
-                            </w:rPr>
-                          </w:pPr>
-                          <w:r>
-                            <w:rPr>
-                              <w:rFonts w:ascii="Arial" w:hAnsi="Arial"/>
-                              <w:b/>
-                              <w:sz w:val="18"/>
-                            </w:rPr>
-                            <w:t>Superintendência</w:t>
-                          </w:r>
-                          <w:r>
-                            <w:rPr>
-                              <w:rFonts w:ascii="Arial" w:hAnsi="Arial"/>
-                              <w:b/>
-                              <w:spacing w:val="40"/>
-                              <w:sz w:val="18"/>
-                            </w:rPr>
-                            <w:t xml:space="preserve"> </w:t>
-                          </w:r>
-                          <w:r>
-                            <w:rPr>
-                              <w:rFonts w:ascii="Arial" w:hAnsi="Arial"/>
-                              <w:b/>
-                              <w:sz w:val="18"/>
-                            </w:rPr>
-                            <w:t>Regional do Trabalho no Estado de Goiás</w:t>
-                          </w:r>
-                        </w:p>
-                        <w:p>
-                          <w:pPr>
-                            <w:spacing w:before="14"/>
-                            <w:ind w:left="20"/>
-                            <w:rPr>
-                              <w:rFonts w:ascii="Arial" w:hAnsi="Arial"/>
-                              <w:b/>
-                              <w:sz w:val="18"/>
-                            </w:rPr>
-                          </w:pPr>
-                          <w:r>
-                            <w:rPr>
-                              <w:rFonts w:ascii="Arial" w:hAnsi="Arial"/>
-                              <w:b/>
-                              <w:sz w:val="18"/>
-                            </w:rPr>
-                            <w:t>Setor de Inspeção do Trabalho</w:t>
-                          </w:r>
-                        </w:p>
-                      </w:txbxContent>
-                    </wps:txbx>
-                    <wps:bodyPr wrap="square" lIns="0" tIns="0" rIns="0" bIns="0" rtlCol="0">
-                      <a:noAutofit/>
-                    </wps:bodyPr>
-                  </wps:wsp>
-                </a:graphicData>
-              </a:graphic>
-              <wp14:sizeRelV relativeFrom="margin">
-                <wp14:pctHeight>0</wp14:pctHeight>
-              </wp14:sizeRelV>
-            </wp:anchor>
-          </w:drawing>
-        </mc:Choice>
-        <mc:Fallback>
-          <w:pict>
-            <v:shapetype w14:anchorId="3EBECDAF" id="_x0000_t202" coordsize="21600,21600" o:spt="202" path="m,l,21600r21600,l21600,xe">
-              <v:stroke joinstyle="miter"/>
-              <v:path gradientshapeok="t" o:connecttype="rect"/>
-            </v:shapetype>
-            <v:shape id="_x0000_s1027" type="#_x0000_t202" style="position:absolute;margin-left:194.65pt;margin-top:24.7pt;width:309.65pt;height:43.15pt;z-index:-15866880;visibility:visible;mso-wrap-style:square;mso-height-percent:0;mso-wrap-distance-left:0;mso-wrap-distance-top:0;mso-wrap-distance-right:0;mso-wrap-distance-bottom:0;mso-position-horizontal:absolute;mso-position-horizontal-relative:page;mso-position-vertical:absolute;mso-position-vertical-relative:page;mso-height-percent:0;mso-height-relative:margin;v-text-anchor:top" o:gfxdata="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" filled="f" stroked="f">
-              <v:textbox inset="0,0,0,0">
-                <w:txbxContent>
-                  <w:p>
-                    <w:pPr>
-                      <w:spacing w:before="14"/>
-                      <w:ind w:left="20"/>
-                      <w:rPr>
-                        <w:rFonts w:ascii="Arial" w:hAnsi="Arial"/>
-                        <w:b/>
-                        <w:sz w:val="18"/>
-                      </w:rPr>
-                    </w:pPr>
-                    <w:r>
-                      <w:rPr>
-                        <w:rFonts w:ascii="Arial" w:hAnsi="Arial"/>
-                        <w:b/>
-                        <w:sz w:val="18"/>
-                      </w:rPr>
-                      <w:t>Ministério</w:t>
-                    </w:r>
-                    <w:r>
-                      <w:rPr>
-                        <w:rFonts w:ascii="Arial" w:hAnsi="Arial"/>
-                        <w:b/>
-                        <w:spacing w:val="-4"/>
-                        <w:sz w:val="18"/>
-                      </w:rPr>
-                      <w:t xml:space="preserve"> </w:t>
-                    </w:r>
-                    <w:r>
-                      <w:rPr>
-                        <w:rFonts w:ascii="Arial" w:hAnsi="Arial"/>
-                        <w:b/>
-                        <w:sz w:val="18"/>
-                      </w:rPr>
-                      <w:t>do Trabalho e Emprego</w:t>
-                    </w:r>
-                  </w:p>
-                  <w:p>
-                    <w:pPr>
-                      <w:spacing w:before="14"/>
-                      <w:ind w:left="20"/>
-                      <w:rPr>
-                        <w:rFonts w:ascii="Arial" w:hAnsi="Arial"/>
-                        <w:b/>
-                        <w:sz w:val="18"/>
-                      </w:rPr>
-                    </w:pPr>
-                    <w:r>
-                      <w:rPr>
-                        <w:rFonts w:ascii="Arial" w:hAnsi="Arial"/>
-                        <w:b/>
-                        <w:sz w:val="18"/>
-                      </w:rPr>
-                      <w:t>Secretaria</w:t>
-                    </w:r>
-                    <w:r>
-                      <w:rPr>
-                        <w:rFonts w:ascii="Arial" w:hAnsi="Arial"/>
-                        <w:b/>
-                        <w:spacing w:val="-4"/>
-                        <w:sz w:val="18"/>
-                      </w:rPr>
-                      <w:t xml:space="preserve"> </w:t>
-                    </w:r>
-                    <w:r>
-                      <w:rPr>
-                        <w:rFonts w:ascii="Arial" w:hAnsi="Arial"/>
-                        <w:b/>
-                        <w:sz w:val="18"/>
-                      </w:rPr>
-                      <w:t>de Inspeção do</w:t>
-                    </w:r>
-                    <w:r>
-                      <w:rPr>
-                        <w:rFonts w:ascii="Arial" w:hAnsi="Arial"/>
-                        <w:b/>
-                        <w:spacing w:val="-6"/>
-                        <w:sz w:val="18"/>
-                      </w:rPr>
-                      <w:t xml:space="preserve"> </w:t>
-                    </w:r>
-                    <w:r>
-                      <w:rPr>
-                        <w:rFonts w:ascii="Arial" w:hAnsi="Arial"/>
-                        <w:b/>
-                        <w:sz w:val="18"/>
-                      </w:rPr>
-                      <w:t xml:space="preserve">Trabalho </w:t>
-                    </w:r>
-                  </w:p>
-                  <w:p>
-                    <w:pPr>
-                      <w:spacing w:before="14"/>
-                      <w:ind w:left="20"/>
-                      <w:rPr>
-                        <w:rFonts w:ascii="Arial" w:hAnsi="Arial"/>
-                        <w:b/>
-                        <w:sz w:val="18"/>
-                      </w:rPr>
-                    </w:pPr>
-                    <w:r>
-                      <w:rPr>
-                        <w:rFonts w:ascii="Arial" w:hAnsi="Arial"/>
-                        <w:b/>
-                        <w:sz w:val="18"/>
-                      </w:rPr>
-                      <w:t>Superintendência</w:t>
-                    </w:r>
-                    <w:r>
-                      <w:rPr>
-                        <w:rFonts w:ascii="Arial" w:hAnsi="Arial"/>
-                        <w:b/>
-                        <w:spacing w:val="40"/>
-                        <w:sz w:val="18"/>
-                      </w:rPr>
-                      <w:t xml:space="preserve"> </w:t>
-                    </w:r>
-                    <w:r>
-                      <w:rPr>
-                        <w:rFonts w:ascii="Arial" w:hAnsi="Arial"/>
-                        <w:b/>
-                        <w:sz w:val="18"/>
-                      </w:rPr>
-                      <w:t>Regional do Trabalho no Estado de Goiás</w:t>
-                    </w:r>
-                  </w:p>
-                  <w:p>
-                    <w:pPr>
-                      <w:spacing w:before="14"/>
-                      <w:ind w:left="20"/>
-                      <w:rPr>
-                        <w:rFonts w:ascii="Arial" w:hAnsi="Arial"/>
-                        <w:b/>
-                        <w:sz w:val="18"/>
-                      </w:rPr>
-                    </w:pPr>
-                    <w:r>
-                      <w:rPr>
-                        <w:rFonts w:ascii="Arial" w:hAnsi="Arial"/>
-                        <w:b/>
-                        <w:sz w:val="18"/>
-                      </w:rPr>
-                      <w:t>Setor de Inspeção do Trabalho</w:t>
-                    </w:r>
-                  </w:p>
-                </w:txbxContent>
-              </v:textbox>
-              <w10:wrap anchorx="page" anchory="page"/>
-            </v:shape>
           </w:pict>
         </mc:Fallback>
       </mc:AlternateContent>
@@ -8725,6 +8331,88 @@
         <w:sz w:val="20"/>
       </w:rPr>
     </w:pPr>
+    <w:r>
+      <w:rPr>
+        <w:noProof/>
+        <w:sz w:val="20"/>
+      </w:rPr>
+      <mc:AlternateContent>
+        <mc:Choice Requires="wps">
+          <w:drawing>
+            <wp:anchor distT="0" distB="0" distL="114300" distR="114300" simplePos="0" relativeHeight="487448576" behindDoc="1" locked="0" layoutInCell="1" allowOverlap="1" wp14:anchorId="520D9E4D" wp14:editId="468761DA">
+              <wp:simplePos x="0" y="0"/>
+              <wp:positionH relativeFrom="column">
+                <wp:posOffset>-19524</wp:posOffset>
+              </wp:positionH>
+              <wp:positionV relativeFrom="paragraph">
+                <wp:posOffset>578548</wp:posOffset>
+              </wp:positionV>
+              <wp:extent cx="6519545" cy="18415"/>
+              <wp:effectExtent l="0" t="0" r="0" b="0"/>
+              <wp:wrapNone/>
+              <wp:docPr id="848259327" name="Graphic 2"/>
+              <wp:cNvGraphicFramePr/>
+              <a:graphic xmlns:a="http://schemas.openxmlformats.org/drawingml/2006/main">
+                <a:graphicData uri="http://schemas.microsoft.com/office/word/2010/wordprocessingShape">
+                  <wps:wsp>
+                    <wps:cNvSpPr/>
+                    <wps:spPr>
+                      <a:xfrm>
+                        <a:off x="0" y="0"/>
+                        <a:ext cx="6519545" cy="18415"/>
+                      </a:xfrm>
+                      <a:custGeom>
+                        <a:avLst/>
+                        <a:gdLst/>
+                        <a:ahLst/>
+                        <a:cxnLst/>
+                        <a:rect l="l" t="t" r="r" b="b"/>
+                        <a:pathLst>
+                          <a:path w="6519545" h="18415">
+                            <a:moveTo>
+                              <a:pt x="6519418" y="0"/>
+                            </a:moveTo>
+                            <a:lnTo>
+                              <a:pt x="0" y="0"/>
+                            </a:lnTo>
+                            <a:lnTo>
+                              <a:pt x="0" y="18288"/>
+                            </a:lnTo>
+                            <a:lnTo>
+                              <a:pt x="6519418" y="18288"/>
+                            </a:lnTo>
+                            <a:lnTo>
+                              <a:pt x="6519418" y="0"/>
+                            </a:lnTo>
+                            <a:close/>
+                          </a:path>
+                        </a:pathLst>
+                      </a:custGeom>
+                      <a:solidFill>
+                        <a:srgbClr val="000000"/>
+                      </a:solidFill>
+                    </wps:spPr>
+                    <wps:bodyPr wrap="square" lIns="0" tIns="0" rIns="0" bIns="0" rtlCol="0">
+                      <a:prstTxWarp prst="textNoShape">
+                        <a:avLst/>
+                      </a:prstTxWarp>
+                      <a:noAutofit/>
+                    </wps:bodyPr>
+                  </wps:wsp>
+                </a:graphicData>
+              </a:graphic>
+            </wp:anchor>
+          </w:drawing>
+        </mc:Choice>
+        <mc:Fallback>
+          <w:pict>
+            <v:shape w14:anchorId="71617ED9" id="Graphic 2" o:spid="_x0000_s1026" style="position:absolute;margin-left:-1.55pt;margin-top:45.55pt;width:513.35pt;height:1.45pt;z-index:-15867904;visibility:visible;mso-wrap-style:square;mso-wrap-distance-left:9pt;mso-wrap-distance-top:0;mso-wrap-distance-right:9pt;mso-wrap-distance-bottom:0;mso-position-horizontal:absolute;mso-position-horizontal-relative:text;mso-position-vertical:absolute;mso-position-vertical-relative:text;v-text-anchor:top" coordsize="6519545,18415" o:gfxdata="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" path="m6519418,l,,,18288r6519418,l6519418,xe" fillcolor="black" stroked="f">
+              <v:path arrowok="t"/>
+            </v:shape>
+          </w:pict>
+        </mc:Fallback>
+      </mc:AlternateContent>
+    </w:r>
   </w:p>
 </w:hdr>
 </file>
@@ -11637,6 +11325,28 @@
 </a:theme>
 </file>
 
+<file path=word/webextensions/taskpanes.xml><?xml version="1.0" encoding="utf-8"?>
+<wetp:taskpanes xmlns:wetp="http://schemas.microsoft.com/office/webextensions/taskpanes/2010/11">
+  <wetp:taskpane dockstate="right" visibility="0" width="350" row="0">
+    <wetp:webextensionref xmlns:r="http://schemas.openxmlformats.org/officeDocument/2006/relationships" r:id="rId1"/>
+  </wetp:taskpane>
+</wetp:taskpanes>
+</file>
+
+<file path=word/webextensions/webextension1.xml><?xml version="1.0" encoding="utf-8"?>
+<we:webextension xmlns:we="http://schemas.microsoft.com/office/webextensions/webextension/2010/11" id="{C4FD2833-20F2-DC42-BCC2-7017A2DB01D1}">
+  <we:reference id="WA200010725" version="1.0.0.1" store="Omex" storeType="OMEX"/>
+  <we:alternateReferences>
+    <we:reference id="WA200010725" version="1.0.0.1" store="WA200010725" storeType="OMEX"/>
+  </we:alternateReferences>
+  <we:properties>
+    <we:property name="claude.fileId" value="&quot;524207f8-c4a1-4865-8046-4f82502dd34d&quot;"/>
+  </we:properties>
+  <we:bindings/>
+  <we:snapshot xmlns:r="http://schemas.openxmlformats.org/officeDocument/2006/relationships"/>
+</we:webextension>
+</file>
+
 <file path=customXml/item1.xml><?xml version="1.0" encoding="utf-8"?>
 <b:Sources xmlns:b="http://schemas.openxmlformats.org/officeDocument/2006/bibliography" xmlns="http://schemas.openxmlformats.org/officeDocument/2006/bibliography" SelectedStyle="\APASixthEditionOfficeOnline.xsl" StyleName="APA" Version="6"/>
 </file>

</xml_diff>

<commit_message>
fix(rt-rgi): remove residuo 'SRTE-GO' do template e retira aviso obsoleto
O Ricardo editou o template.docx diretamente na main removendo a mencao
fixa a 'SRTE-GO (midia digital)' na Observacao 2 (protocolo alternativo
se o SEI estiver indisponivel), deixando o texto impessoal. Sincronizado
o .docx corrigido para este worktree e a linha de aviso na tabela de
casos especiais do SKILL.md, que citava o residuo, foi removida por
ficar obsoleta.

Co-Authored-By: Claude Fable 5 <noreply@anthropic.com>
</commit_message>
<xml_diff>
--- a/aft-rt-rgi/template.docx
+++ b/aft-rt-rgi/template.docx
@@ -341,6 +341,7 @@
         </w:rPr>
         <w:t xml:space="preserve"> </w:t>
       </w:r>
+      <w:proofErr w:type="gramStart"/>
       <w:r>
         <w:rPr>
           <w:rFonts w:ascii="Tahoma" w:hAnsi="Tahoma" w:cs="Tahoma"/>
@@ -366,6 +367,7 @@
         </w:rPr>
         <w:t>dispõe</w:t>
       </w:r>
+      <w:proofErr w:type="gramEnd"/>
       <w:r>
         <w:rPr>
           <w:rFonts w:ascii="Tahoma" w:hAnsi="Tahoma" w:cs="Tahoma"/>
@@ -808,13 +810,23 @@
         </w:rPr>
         <w:t xml:space="preserve"> </w:t>
       </w:r>
-      <w:r>
-        <w:rPr>
-          <w:rFonts w:ascii="Tahoma" w:hAnsi="Tahoma" w:cs="Tahoma"/>
-          <w:sz w:val="22"/>
-          <w:szCs w:val="22"/>
-        </w:rPr>
-        <w:t>Mannrich,</w:t>
+      <w:proofErr w:type="spellStart"/>
+      <w:r>
+        <w:rPr>
+          <w:rFonts w:ascii="Tahoma" w:hAnsi="Tahoma" w:cs="Tahoma"/>
+          <w:sz w:val="22"/>
+          <w:szCs w:val="22"/>
+        </w:rPr>
+        <w:t>Mannrich</w:t>
+      </w:r>
+      <w:proofErr w:type="spellEnd"/>
+      <w:r>
+        <w:rPr>
+          <w:rFonts w:ascii="Tahoma" w:hAnsi="Tahoma" w:cs="Tahoma"/>
+          <w:sz w:val="22"/>
+          <w:szCs w:val="22"/>
+        </w:rPr>
+        <w:t>,</w:t>
       </w:r>
       <w:r>
         <w:rPr>
@@ -881,7 +893,27 @@
           <w:sz w:val="20"/>
           <w:szCs w:val="20"/>
         </w:rPr>
-        <w:t>como as referentes a</w:t>
+        <w:t xml:space="preserve">como </w:t>
+      </w:r>
+      <w:proofErr w:type="gramStart"/>
+      <w:r>
+        <w:rPr>
+          <w:rFonts w:ascii="Tahoma" w:hAnsi="Tahoma" w:cs="Tahoma"/>
+          <w:i/>
+          <w:sz w:val="20"/>
+          <w:szCs w:val="20"/>
+        </w:rPr>
+        <w:t>as referentes</w:t>
+      </w:r>
+      <w:proofErr w:type="gramEnd"/>
+      <w:r>
+        <w:rPr>
+          <w:rFonts w:ascii="Tahoma" w:hAnsi="Tahoma" w:cs="Tahoma"/>
+          <w:i/>
+          <w:sz w:val="20"/>
+          <w:szCs w:val="20"/>
+        </w:rPr>
+        <w:t xml:space="preserve"> a</w:t>
       </w:r>
       <w:r>
         <w:rPr>
@@ -2719,6 +2751,7 @@
         </w:rPr>
         <w:t xml:space="preserve">O percurso da fiscalização foi acompanhado por </w:t>
       </w:r>
+      <w:proofErr w:type="spellStart"/>
       <w:r>
         <w:rPr>
           <w:rFonts w:ascii="Tahoma" w:hAnsi="Tahoma" w:cs="Tahoma"/>
@@ -2727,6 +2760,7 @@
         </w:rPr>
         <w:t>preoposto</w:t>
       </w:r>
+      <w:proofErr w:type="spellEnd"/>
       <w:r>
         <w:rPr>
           <w:rFonts w:ascii="Tahoma" w:hAnsi="Tahoma" w:cs="Tahoma"/>
@@ -2896,15 +2930,33 @@
           <w:sz w:val="22"/>
           <w:szCs w:val="22"/>
         </w:rPr>
-        <w:t xml:space="preserve">Regulamentadoras expedidas pelo </w:t>
-      </w:r>
-      <w:r>
-        <w:rPr>
-          <w:rFonts w:ascii="Tahoma" w:hAnsi="Tahoma" w:cs="Tahoma"/>
-          <w:sz w:val="22"/>
-          <w:szCs w:val="22"/>
-        </w:rPr>
-        <w:t xml:space="preserve"> Ministério do Trabalho</w:t>
+        <w:t xml:space="preserve">Regulamentadoras expedidas </w:t>
+      </w:r>
+      <w:proofErr w:type="gramStart"/>
+      <w:r>
+        <w:rPr>
+          <w:rFonts w:ascii="Tahoma" w:hAnsi="Tahoma" w:cs="Tahoma"/>
+          <w:sz w:val="22"/>
+          <w:szCs w:val="22"/>
+        </w:rPr>
+        <w:t xml:space="preserve">pelo </w:t>
+      </w:r>
+      <w:r>
+        <w:rPr>
+          <w:rFonts w:ascii="Tahoma" w:hAnsi="Tahoma" w:cs="Tahoma"/>
+          <w:sz w:val="22"/>
+          <w:szCs w:val="22"/>
+        </w:rPr>
+        <w:t xml:space="preserve"> Ministério</w:t>
+      </w:r>
+      <w:proofErr w:type="gramEnd"/>
+      <w:r>
+        <w:rPr>
+          <w:rFonts w:ascii="Tahoma" w:hAnsi="Tahoma" w:cs="Tahoma"/>
+          <w:sz w:val="22"/>
+          <w:szCs w:val="22"/>
+        </w:rPr>
+        <w:t xml:space="preserve"> do Trabalho</w:t>
       </w:r>
       <w:r>
         <w:rPr>
@@ -3877,8 +3929,9 @@
           <w:szCs w:val="22"/>
           <w:u w:val="single"/>
         </w:rPr>
-        <w:t xml:space="preserve"> -</w:t>
-      </w:r>
+        <w:t xml:space="preserve"> </w:t>
+      </w:r>
+      <w:proofErr w:type="gramStart"/>
       <w:r>
         <w:rPr>
           <w:rFonts w:ascii="Tahoma" w:hAnsi="Tahoma" w:cs="Tahoma"/>
@@ -3888,7 +3941,7 @@
           <w:szCs w:val="22"/>
           <w:u w:val="single"/>
         </w:rPr>
-        <w:t xml:space="preserve"> </w:t>
+        <w:t>-</w:t>
       </w:r>
       <w:r>
         <w:rPr>
@@ -3899,7 +3952,30 @@
           <w:szCs w:val="22"/>
           <w:u w:val="single"/>
         </w:rPr>
-        <w:t xml:space="preserve"> Paralisação: TOTAL</w:t>
+        <w:t xml:space="preserve"> </w:t>
+      </w:r>
+      <w:r>
+        <w:rPr>
+          <w:rFonts w:ascii="Tahoma" w:hAnsi="Tahoma" w:cs="Tahoma"/>
+          <w:b/>
+          <w:bCs/>
+          <w:sz w:val="22"/>
+          <w:szCs w:val="22"/>
+          <w:u w:val="single"/>
+        </w:rPr>
+        <w:t xml:space="preserve"> Paralisação</w:t>
+      </w:r>
+      <w:proofErr w:type="gramEnd"/>
+      <w:r>
+        <w:rPr>
+          <w:rFonts w:ascii="Tahoma" w:hAnsi="Tahoma" w:cs="Tahoma"/>
+          <w:b/>
+          <w:bCs/>
+          <w:sz w:val="22"/>
+          <w:szCs w:val="22"/>
+          <w:u w:val="single"/>
+        </w:rPr>
+        <w:t>: TOTAL</w:t>
       </w:r>
     </w:p>
     <w:p>
@@ -5698,7 +5774,25 @@
           <w:sz w:val="21"/>
           <w:szCs w:val="21"/>
         </w:rPr>
-        <w:t xml:space="preserve"> verificou-se a exposição individual ou de poucos trabalhadores expostos aos fatores de risco, será utilizada a Tabela 3.3 para a determinação do excesso de risco, sendo que as medidas administrativas de Interdição ou Embargo devem ser aplicadas sempre que o Auditor-Fiscal do Trabalho constatar a existência de excesso de risco Extremo (E) ou Significativo (S).</w:t>
+        <w:t xml:space="preserve"> verificou-se a exposição individual ou de poucos trabalhadores expostos aos fatores de risco, será utilizada a Tabela 3.3 para a determinação do excesso de risco, sendo que as medidas administrativas de Interdição ou Embargo devem ser aplicadas sempre que o Auditor-Fiscal do Trabalho constatar a existência de excesso de risco Extremo (E) </w:t>
+      </w:r>
+      <w:proofErr w:type="gramStart"/>
+      <w:r>
+        <w:rPr>
+          <w:rFonts w:ascii="Tahoma" w:hAnsi="Tahoma" w:cs="Tahoma"/>
+          <w:sz w:val="21"/>
+          <w:szCs w:val="21"/>
+        </w:rPr>
+        <w:t>ou Significativo</w:t>
+      </w:r>
+      <w:proofErr w:type="gramEnd"/>
+      <w:r>
+        <w:rPr>
+          <w:rFonts w:ascii="Tahoma" w:hAnsi="Tahoma" w:cs="Tahoma"/>
+          <w:sz w:val="21"/>
+          <w:szCs w:val="21"/>
+        </w:rPr>
+        <w:t xml:space="preserve"> (S).</w:t>
       </w:r>
     </w:p>
     <w:p>
@@ -6091,7 +6185,29 @@
           <w:sz w:val="22"/>
           <w:szCs w:val="22"/>
         </w:rPr>
-        <w:t xml:space="preserve">Fator de Risco : excesso de risco </w:t>
+        <w:t xml:space="preserve">Fator de </w:t>
+      </w:r>
+      <w:proofErr w:type="gramStart"/>
+      <w:r>
+        <w:rPr>
+          <w:rFonts w:ascii="Tahoma" w:hAnsi="Tahoma" w:cs="Tahoma"/>
+          <w:b/>
+          <w:bCs/>
+          <w:sz w:val="22"/>
+          <w:szCs w:val="22"/>
+        </w:rPr>
+        <w:t>Risco :</w:t>
+      </w:r>
+      <w:proofErr w:type="gramEnd"/>
+      <w:r>
+        <w:rPr>
+          <w:rFonts w:ascii="Tahoma" w:hAnsi="Tahoma" w:cs="Tahoma"/>
+          <w:b/>
+          <w:bCs/>
+          <w:sz w:val="22"/>
+          <w:szCs w:val="22"/>
+        </w:rPr>
+        <w:t xml:space="preserve"> excesso de risco </w:t>
       </w:r>
     </w:p>
     <w:p>
@@ -6265,7 +6381,25 @@
           <w:sz w:val="22"/>
           <w:szCs w:val="22"/>
         </w:rPr>
-        <w:t xml:space="preserve"> sobre quais objetos solicita a suspensão da interdição, podendo ser um ou todos objetos;</w:t>
+        <w:t xml:space="preserve"> sobre quais objetos solicita a suspensão da interdição, podendo ser um ou </w:t>
+      </w:r>
+      <w:proofErr w:type="gramStart"/>
+      <w:r>
+        <w:rPr>
+          <w:rFonts w:ascii="Tahoma" w:hAnsi="Tahoma" w:cs="Tahoma"/>
+          <w:sz w:val="22"/>
+          <w:szCs w:val="22"/>
+        </w:rPr>
+        <w:t>todos objetos</w:t>
+      </w:r>
+      <w:proofErr w:type="gramEnd"/>
+      <w:r>
+        <w:rPr>
+          <w:rFonts w:ascii="Tahoma" w:hAnsi="Tahoma" w:cs="Tahoma"/>
+          <w:sz w:val="22"/>
+          <w:szCs w:val="22"/>
+        </w:rPr>
+        <w:t>;</w:t>
       </w:r>
     </w:p>
     <w:p>
@@ -6620,6 +6754,38 @@
     </w:p>
     <w:p>
       <w:pPr>
+        <w:jc w:val="both"/>
+        <w:rPr>
+          <w:rFonts w:ascii="Tahoma" w:hAnsi="Tahoma" w:cs="Tahoma"/>
+        </w:rPr>
+      </w:pPr>
+      <w:r>
+        <w:rPr>
+          <w:rFonts w:ascii="Tahoma" w:hAnsi="Tahoma" w:cs="Tahoma"/>
+        </w:rPr>
+        <w:t xml:space="preserve">Sanadas as irregularidades apuradas, a empresa deverá requerer, por escrito, a suspensão da interdição </w:t>
+      </w:r>
+      <w:r>
+        <w:rPr>
+          <w:rFonts w:ascii="Tahoma" w:hAnsi="Tahoma" w:cs="Tahoma"/>
+        </w:rPr>
+        <w:t xml:space="preserve">para </w:t>
+      </w:r>
+      <w:r>
+        <w:rPr>
+          <w:rFonts w:ascii="Tahoma" w:hAnsi="Tahoma" w:cs="Tahoma"/>
+        </w:rPr>
+        <w:t>unidade regional descrita no cabeçalho da primeira folha do Termo.</w:t>
+      </w:r>
+      <w:r>
+        <w:rPr>
+          <w:rFonts w:ascii="Tahoma" w:hAnsi="Tahoma" w:cs="Tahoma"/>
+        </w:rPr>
+        <w:br/>
+      </w:r>
+    </w:p>
+    <w:p>
+      <w:pPr>
         <w:pStyle w:val="Corpodetexto"/>
         <w:ind w:right="-143"/>
         <w:jc w:val="both"/>
@@ -6635,15 +6801,7 @@
           <w:sz w:val="21"/>
           <w:szCs w:val="21"/>
         </w:rPr>
-        <w:t>Sanadas as irregularidades apuradas, a empresa deverá requerer, por escrito, a suspensão da interdição à SUPERINTENDÊNCIA REGIONAL DO TRABALHO E EMPREGO DE GOIÁS, Seção de Segurança e Saúde no Trabalho.</w:t>
-      </w:r>
-      <w:r>
-        <w:rPr>
-          <w:rFonts w:ascii="Tahoma" w:hAnsi="Tahoma" w:cs="Tahoma"/>
-          <w:sz w:val="21"/>
-          <w:szCs w:val="21"/>
-        </w:rPr>
-        <w:br/>
+        <w:t>O requerimento deverá conter (Art.89, § único, Portaria nº 672, 20 21):</w:t>
       </w:r>
     </w:p>
     <w:p>
@@ -6663,7 +6821,25 @@
           <w:sz w:val="21"/>
           <w:szCs w:val="21"/>
         </w:rPr>
-        <w:t>O requerimento deverá conter (Art.89, § único, Portaria nº 672, 20 21):</w:t>
+        <w:t xml:space="preserve">I - </w:t>
+      </w:r>
+      <w:proofErr w:type="gramStart"/>
+      <w:r>
+        <w:rPr>
+          <w:rFonts w:ascii="Tahoma" w:hAnsi="Tahoma" w:cs="Tahoma"/>
+          <w:sz w:val="21"/>
+          <w:szCs w:val="21"/>
+        </w:rPr>
+        <w:t>o</w:t>
+      </w:r>
+      <w:proofErr w:type="gramEnd"/>
+      <w:r>
+        <w:rPr>
+          <w:rFonts w:ascii="Tahoma" w:hAnsi="Tahoma" w:cs="Tahoma"/>
+          <w:sz w:val="21"/>
+          <w:szCs w:val="21"/>
+        </w:rPr>
+        <w:t xml:space="preserve"> número do Termo de Interdição;</w:t>
       </w:r>
     </w:p>
     <w:p>
@@ -6683,27 +6859,25 @@
           <w:sz w:val="21"/>
           <w:szCs w:val="21"/>
         </w:rPr>
-        <w:t>I - o número do Termo de Interdição;</w:t>
-      </w:r>
-    </w:p>
-    <w:p>
-      <w:pPr>
-        <w:pStyle w:val="Corpodetexto"/>
-        <w:ind w:right="-143"/>
-        <w:jc w:val="both"/>
+        <w:t xml:space="preserve">II - </w:t>
+      </w:r>
+      <w:proofErr w:type="gramStart"/>
+      <w:r>
         <w:rPr>
           <w:rFonts w:ascii="Tahoma" w:hAnsi="Tahoma" w:cs="Tahoma"/>
           <w:sz w:val="21"/>
           <w:szCs w:val="21"/>
         </w:rPr>
-      </w:pPr>
+        <w:t>a</w:t>
+      </w:r>
+      <w:proofErr w:type="gramEnd"/>
       <w:r>
         <w:rPr>
           <w:rFonts w:ascii="Tahoma" w:hAnsi="Tahoma" w:cs="Tahoma"/>
           <w:sz w:val="21"/>
           <w:szCs w:val="21"/>
         </w:rPr>
-        <w:t>II - a identificação da(s) máquina(s) ou setor de serviço;</w:t>
+        <w:t xml:space="preserve"> identificação da(s) máquina(s) ou setor de serviço;</w:t>
       </w:r>
     </w:p>
     <w:p>
@@ -7101,7 +7275,15 @@
           <w:sz w:val="21"/>
           <w:szCs w:val="21"/>
         </w:rPr>
-        <w:t>Em caso de dificuldade no SEI ou urgência, pode protocolar diretamente no setor de protocolo da SRTE-GO (mídia digital) no endereço descrito no Termo de interdição.</w:t>
+        <w:t>Em caso de dificuldade no SEI ou urgência, pode protocolar diretamente no setor de protocolo no endereço descrito no Termo</w:t>
+      </w:r>
+      <w:r>
+        <w:rPr>
+          <w:rFonts w:ascii="Tahoma" w:hAnsi="Tahoma" w:cs="Tahoma"/>
+          <w:sz w:val="21"/>
+          <w:szCs w:val="21"/>
+        </w:rPr>
+        <w:t>.</w:t>
       </w:r>
     </w:p>
     <w:p>
@@ -7694,7 +7876,7 @@
                                   <pic:cNvPicPr/>
                                 </pic:nvPicPr>
                                 <pic:blipFill>
-                                  <a:blip r:embed="rId1">
+                                  <a:blip r:embed="rId2">
                                     <a:extLst>
                                       <a:ext uri="{28A0092B-C50C-407E-A947-70E740481C1C}">
                                         <a14:useLocalDpi xmlns:a14="http://schemas.microsoft.com/office/drawing/2010/main" val="0"/>
@@ -7817,7 +7999,7 @@
                         <pic:cNvPicPr/>
                       </pic:nvPicPr>
                       <pic:blipFill>
-                        <a:blip r:embed="rId2" cstate="print"/>
+                        <a:blip r:embed="rId3" cstate="print"/>
                         <a:stretch>
                           <a:fillRect/>
                         </a:stretch>
@@ -7864,7 +8046,7 @@
                 <o:lock v:ext="edit" aspectratio="t"/>
               </v:shapetype>
               <v:shape id="Image 3" o:spid="_x0000_s1028" type="#_x0000_t75" style="position:absolute;width:16912;height:7639;visibility:visible;mso-wrap-style:square" o:gfxdata="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">
-                <v:imagedata r:id="rId3" o:title=""/>
+                <v:imagedata r:id="rId4" o:title=""/>
               </v:shape>
               <w10:wrap anchorx="page" anchory="page"/>
             </v:group>
@@ -8144,7 +8326,7 @@
                                   <pic:cNvPicPr/>
                                 </pic:nvPicPr>
                                 <pic:blipFill>
-                                  <a:blip r:embed="rId1">
+                                  <a:blip r:embed="rId2">
                                     <a:extLst>
                                       <a:ext uri="{28A0092B-C50C-407E-A947-70E740481C1C}">
                                         <a14:useLocalDpi xmlns:a14="http://schemas.microsoft.com/office/drawing/2010/main" val="0"/>
@@ -8267,7 +8449,7 @@
                         <pic:cNvPicPr/>
                       </pic:nvPicPr>
                       <pic:blipFill>
-                        <a:blip r:embed="rId2" cstate="print"/>
+                        <a:blip r:embed="rId3" cstate="print"/>
                         <a:stretch>
                           <a:fillRect/>
                         </a:stretch>
@@ -8314,7 +8496,7 @@
                 <o:lock v:ext="edit" aspectratio="t"/>
               </v:shapetype>
               <v:shape id="Image 3" o:spid="_x0000_s1028" type="#_x0000_t75" style="position:absolute;width:16912;height:7639;visibility:visible;mso-wrap-style:square" o:gfxdata="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">
-                <v:imagedata r:id="rId3" o:title=""/>
+                <v:imagedata r:id="rId4" o:title=""/>
               </v:shape>
               <w10:wrap anchorx="page" anchory="page"/>
             </v:group>

</xml_diff>